<commit_message>
Passage à la marque Credaura : logo, nom et signature
- Logo « maison dans un sceau d'or » (piste B3) : en-tête du site, favicon,
  couverture du rapport Word et icône de l'application Mac, dessiné une
  seule fois (gui/theme.LOGO_SVG, app/visuels_dossier.logo).
- En-tête : « Credaura » (« aura » en laiton) et la signature « Convaincre
  mon banquier », centrés l'un sur l'autre ; le bloc descend sous le bouton
  du thème sur téléphone.
- Fiabimmo devient Credaura partout : titre, rapport (en-têtes, pieds de
  page, couverture), mention légale, nom du fichier téléchargé, README.
- Application Mac : Credaura.app (ancienne Fiabimmo.app retirée à
  l'installation), icône générée à la construction ; le fichier .spec est
  écrit dans le dossier de construction.
- Exemple de dossier régénéré.

Co-Authored-By: Claude Opus 5.5 <noreply@anthropic.com>
</commit_message>
<xml_diff>
--- a/app/data/exemple-dossier/Exemple de dossier de financement.docx
+++ b/app/data/exemple-dossier/Exemple de dossier de financement.docx
@@ -95,7 +95,7 @@
                 <w:color w:val="E9D8B0"/>
                 <w:sz w:val="22"/>
               </w:rPr>
-              <w:t>FIABIMMO  ·  DOSSIER DE FINANCEMENT IMMOBILIER</w:t>
+              <w:t>CREDAURA  ·  DOSSIER DE FINANCEMENT IMMOBILIER</w:t>
             </w:r>
           </w:p>
           <w:p>
@@ -379,7 +379,7 @@
           <w:color w:val="5B6672"/>
           <w:sz w:val="22"/>
         </w:rPr>
-        <w:t>Emprunteur : Camille Exemple (emprunteur fictif)   ·   Document établi le 02/10/2026</w:t>
+        <w:t>Emprunteur : Camille Exemple (emprunteur fictif)   ·   Document établi le 04/10/2026</w:t>
       </w:r>
     </w:p>
     <w:p>
@@ -395,7 +395,7 @@
           <w:color w:val="969EA8"/>
           <w:sz w:val="18"/>
         </w:rPr>
-        <w:t>Document établi avec Fiabimmo — estimation pédagogique, à faire valider par un professionnel avant toute décision.</w:t>
+        <w:t>Document établi avec Credaura — estimation pédagogique, à faire valider par un professionnel avant toute décision.</w:t>
       </w:r>
     </w:p>
     <w:p>
@@ -14512,7 +14512,7 @@
     </w:p>
     <w:p>
       <w:r>
-        <w:t>Fiabimmo produit des calculs à partir des données saisies. Ce n'est ni un conseil en investissement, en financement ou en fiscalité, ni une offre de prêt. Fiabimmo n'est ni un établissement de crédit, ni un intermédiaire en opérations de banque et en services de paiement (IOBSP, article L. 519-1 du Code monétaire et financier) : il ne propose aucun crédit et ne met en relation avec aucun établissement. La banque reste seule décisionnaire.</w:t>
+        <w:t>Credaura produit des calculs à partir des données saisies. Ce n'est ni un conseil en investissement, en financement ou en fiscalité, ni une offre de prêt. Credaura n'est ni un établissement de crédit, ni un intermédiaire en opérations de banque et en services de paiement (IOBSP, article L. 519-1 du Code monétaire et financier) : il ne propose aucun crédit et ne met en relation avec aucun établissement. La banque reste seule décisionnaire.</w:t>
       </w:r>
     </w:p>
     <w:p>
@@ -14560,7 +14560,7 @@
         <w:color w:val="969EA8"/>
         <w:sz w:val="16"/>
       </w:rPr>
-      <w:t>Établi avec Fiabimmo — estimation pédagogique, à faire valider par un professionnel</w:t>
+      <w:t>Établi avec Credaura — estimation pédagogique, à faire valider par un professionnel</w:t>
     </w:r>
     <w:r>
       <w:rPr>
@@ -14665,7 +14665,7 @@
         <w:sz w:val="15"/>
       </w:rPr>
       <w:tab/>
-      <w:t>Établi avec Fiabimmo — estimation à faire valider par un professionnel</w:t>
+      <w:t>Établi avec Credaura — estimation à faire valider par un professionnel</w:t>
     </w:r>
     <w:r>
       <w:rPr>
@@ -14770,7 +14770,7 @@
         <w:sz w:val="15"/>
       </w:rPr>
       <w:tab/>
-      <w:t>Établi avec Fiabimmo — estimation à faire valider par un professionnel</w:t>
+      <w:t>Établi avec Credaura — estimation à faire valider par un professionnel</w:t>
     </w:r>
     <w:r>
       <w:rPr>
@@ -14875,7 +14875,7 @@
         <w:sz w:val="15"/>
       </w:rPr>
       <w:tab/>
-      <w:t>Établi avec Fiabimmo — estimation à faire valider par un professionnel</w:t>
+      <w:t>Établi avec Credaura — estimation à faire valider par un professionnel</w:t>
     </w:r>
     <w:r>
       <w:rPr>
@@ -14980,7 +14980,7 @@
         <w:sz w:val="15"/>
       </w:rPr>
       <w:tab/>
-      <w:t>Établi avec Fiabimmo — estimation à faire valider par un professionnel</w:t>
+      <w:t>Établi avec Credaura — estimation à faire valider par un professionnel</w:t>
     </w:r>
     <w:r>
       <w:rPr>
@@ -15085,7 +15085,7 @@
         <w:sz w:val="15"/>
       </w:rPr>
       <w:tab/>
-      <w:t>Établi avec Fiabimmo — estimation à faire valider par un professionnel</w:t>
+      <w:t>Établi avec Credaura — estimation à faire valider par un professionnel</w:t>
     </w:r>
     <w:r>
       <w:rPr>
@@ -15190,7 +15190,7 @@
         <w:sz w:val="15"/>
       </w:rPr>
       <w:tab/>
-      <w:t>Établi avec Fiabimmo — estimation à faire valider par un professionnel</w:t>
+      <w:t>Établi avec Credaura — estimation à faire valider par un professionnel</w:t>
     </w:r>
     <w:r>
       <w:rPr>
@@ -15295,7 +15295,7 @@
         <w:sz w:val="15"/>
       </w:rPr>
       <w:tab/>
-      <w:t>Établi avec Fiabimmo — estimation à faire valider par un professionnel</w:t>
+      <w:t>Établi avec Credaura — estimation à faire valider par un professionnel</w:t>
     </w:r>
     <w:r>
       <w:rPr>
@@ -15400,7 +15400,7 @@
         <w:sz w:val="15"/>
       </w:rPr>
       <w:tab/>
-      <w:t>Établi avec Fiabimmo — estimation à faire valider par un professionnel</w:t>
+      <w:t>Établi avec Credaura — estimation à faire valider par un professionnel</w:t>
     </w:r>
     <w:r>
       <w:rPr>
@@ -15505,7 +15505,7 @@
         <w:sz w:val="15"/>
       </w:rPr>
       <w:tab/>
-      <w:t>Établi avec Fiabimmo — estimation à faire valider par un professionnel</w:t>
+      <w:t>Établi avec Credaura — estimation à faire valider par un professionnel</w:t>
     </w:r>
     <w:r>
       <w:rPr>
@@ -15610,7 +15610,7 @@
         <w:sz w:val="15"/>
       </w:rPr>
       <w:tab/>
-      <w:t>Établi avec Fiabimmo — estimation à faire valider par un professionnel</w:t>
+      <w:t>Établi avec Credaura — estimation à faire valider par un professionnel</w:t>
     </w:r>
     <w:r>
       <w:rPr>
@@ -15715,7 +15715,7 @@
         <w:sz w:val="15"/>
       </w:rPr>
       <w:tab/>
-      <w:t>Établi avec Fiabimmo — estimation à faire valider par un professionnel</w:t>
+      <w:t>Établi avec Credaura — estimation à faire valider par un professionnel</w:t>
     </w:r>
     <w:r>
       <w:rPr>
@@ -15820,7 +15820,7 @@
         <w:sz w:val="15"/>
       </w:rPr>
       <w:tab/>
-      <w:t>Établi avec Fiabimmo — estimation à faire valider par un professionnel</w:t>
+      <w:t>Établi avec Credaura — estimation à faire valider par un professionnel</w:t>
     </w:r>
     <w:r>
       <w:rPr>
@@ -15892,7 +15892,7 @@
         <w:color w:val="1B3358"/>
         <w:sz w:val="16"/>
       </w:rPr>
-      <w:t>FIABIMMO  ·  DOSSIER DE FINANCEMENT IMMOBILIER</w:t>
+      <w:t>CREDAURA  ·  DOSSIER DE FINANCEMENT IMMOBILIER</w:t>
     </w:r>
     <w:r>
       <w:rPr>

</xml_diff>

<commit_message>
Dossier : les 3 repères du projet en tête de synthèse (faits pour la banque, verdict du site en formule Personnel)
Formules Banque et Complet : titre neutre « Les 3 repères du projet », faits
sans jugement et pastilles de couleur ; formule Personnel : « Projet
solide / à renforcer / à revoir » comme sur le site. Exemple de dossier
régénéré (données DVF à jour) et carte d'exemple de l'accueil alignée.

Co-Authored-By: Claude Opus 5.5 <noreply@anthropic.com>
</commit_message>
<xml_diff>
--- a/app/data/exemple-dossier/Exemple de dossier de financement.docx
+++ b/app/data/exemple-dossier/Exemple de dossier de financement.docx
@@ -379,7 +379,7 @@
           <w:color w:val="5B6672"/>
           <w:sz w:val="22"/>
         </w:rPr>
-        <w:t>Emprunteur : Camille Exemple (emprunteur fictif)   ·   Document établi le 04/10/2026</w:t>
+        <w:t>Emprunteur : Camille Exemple (emprunteur fictif)   ·   Document établi le 05/10/2026</w:t>
       </w:r>
     </w:p>
     <w:p>
@@ -12201,7 +12201,7 @@
                 <w:color w:val="5B6672"/>
                 <w:sz w:val="20"/>
               </w:rPr>
-              <w:t>Le bilan du projet : le verdict, puis les chiffres clés de chaque partie.</w:t>
+              <w:t>Le bilan du projet : les repères essentiels, puis les chiffres clés de chaque partie.</w:t>
             </w:r>
           </w:p>
         </w:tc>
@@ -12249,38 +12249,143 @@
         <w:tc>
           <w:tcPr>
             <w:tcW w:type="dxa" w:w="14797"/>
-            <w:shd w:val="clear" w:color="auto" w:fill="E9F2ED"/>
+            <w:shd w:val="clear" w:color="auto" w:fill="EEF2F7"/>
             <w:tcBorders>
               <w:top w:val="nil"/>
-              <w:left w:val="single" w:sz="36" w:color="2D6A4F"/>
+              <w:left w:val="single" w:sz="36" w:color="1B3358"/>
               <w:bottom w:val="nil"/>
               <w:right w:val="nil"/>
             </w:tcBorders>
             <w:tcMar>
               <w:top w:w="140" w:type="dxa"/>
-              <w:bottom w:w="140" w:type="dxa"/>
+              <w:bottom w:w="150" w:type="dxa"/>
               <w:left w:w="260" w:type="dxa"/>
               <w:right w:w="260" w:type="dxa"/>
             </w:tcMar>
           </w:tcPr>
           <w:p>
             <w:pPr>
-              <w:spacing w:after="0" w:line="240" w:lineRule="auto"/>
+              <w:spacing w:after="80" w:line="240" w:lineRule="auto"/>
             </w:pPr>
             <w:r>
               <w:rPr>
                 <w:rFonts w:ascii="Sora SemiBold" w:hAnsi="Sora SemiBold"/>
                 <w:b w:val="0"/>
                 <w:i w:val="0"/>
-                <w:color w:val="2D6A4F"/>
+                <w:color w:val="1B3358"/>
                 <w:sz w:val="30"/>
               </w:rPr>
-              <w:t>Autofinancé : +46 €/mois de cash-flow net</w:t>
+              <w:t>Les 3 repères du projet</w:t>
             </w:r>
           </w:p>
           <w:p>
             <w:pPr>
-              <w:spacing w:before="40" w:after="0" w:line="240" w:lineRule="auto"/>
+              <w:spacing w:before="60" w:after="0" w:line="240" w:lineRule="auto"/>
+            </w:pPr>
+            <w:r>
+              <w:rPr>
+                <w:rFonts w:ascii="Public Sans" w:hAnsi="Public Sans"/>
+                <w:b w:val="0"/>
+                <w:i w:val="0"/>
+                <w:color w:val="2D6A4F"/>
+                <w:sz w:val="22"/>
+              </w:rPr>
+              <w:t xml:space="preserve">●  </w:t>
+            </w:r>
+            <w:r>
+              <w:rPr>
+                <w:rFonts w:ascii="Public Sans SemiBold" w:hAnsi="Public Sans SemiBold"/>
+                <w:b w:val="0"/>
+                <w:i w:val="0"/>
+                <w:color w:val="1F2833"/>
+                <w:sz w:val="21"/>
+              </w:rPr>
+              <w:t>Rentabilité</w:t>
+            </w:r>
+            <w:r>
+              <w:rPr>
+                <w:rFonts w:ascii="Public Sans" w:hAnsi="Public Sans"/>
+                <w:b w:val="0"/>
+                <w:i w:val="0"/>
+                <w:color w:val="1F2833"/>
+                <w:sz w:val="21"/>
+              </w:rPr>
+              <w:t xml:space="preserve"> : cash-flow net de +46 € par mois après crédit, charges et impôts</w:t>
+            </w:r>
+          </w:p>
+          <w:p>
+            <w:pPr>
+              <w:spacing w:before="60" w:after="0" w:line="240" w:lineRule="auto"/>
+            </w:pPr>
+            <w:r>
+              <w:rPr>
+                <w:rFonts w:ascii="Public Sans" w:hAnsi="Public Sans"/>
+                <w:b w:val="0"/>
+                <w:i w:val="0"/>
+                <w:color w:val="2D6A4F"/>
+                <w:sz w:val="22"/>
+              </w:rPr>
+              <w:t xml:space="preserve">●  </w:t>
+            </w:r>
+            <w:r>
+              <w:rPr>
+                <w:rFonts w:ascii="Public Sans SemiBold" w:hAnsi="Public Sans SemiBold"/>
+                <w:b w:val="0"/>
+                <w:i w:val="0"/>
+                <w:color w:val="1F2833"/>
+                <w:sz w:val="21"/>
+              </w:rPr>
+              <w:t>Prix</w:t>
+            </w:r>
+            <w:r>
+              <w:rPr>
+                <w:rFonts w:ascii="Public Sans" w:hAnsi="Public Sans"/>
+                <w:b w:val="0"/>
+                <w:i w:val="0"/>
+                <w:color w:val="1F2833"/>
+                <w:sz w:val="21"/>
+              </w:rPr>
+              <w:t xml:space="preserve"> : 4 % sous la médiane du quartier</w:t>
+            </w:r>
+          </w:p>
+          <w:p>
+            <w:pPr>
+              <w:spacing w:before="60" w:after="0" w:line="240" w:lineRule="auto"/>
+            </w:pPr>
+            <w:r>
+              <w:rPr>
+                <w:rFonts w:ascii="Public Sans" w:hAnsi="Public Sans"/>
+                <w:b w:val="0"/>
+                <w:i w:val="0"/>
+                <w:color w:val="2D6A4F"/>
+                <w:sz w:val="22"/>
+              </w:rPr>
+              <w:t xml:space="preserve">●  </w:t>
+            </w:r>
+            <w:r>
+              <w:rPr>
+                <w:rFonts w:ascii="Public Sans SemiBold" w:hAnsi="Public Sans SemiBold"/>
+                <w:b w:val="0"/>
+                <w:i w:val="0"/>
+                <w:color w:val="1F2833"/>
+                <w:sz w:val="21"/>
+              </w:rPr>
+              <w:t>Financement</w:t>
+            </w:r>
+            <w:r>
+              <w:rPr>
+                <w:rFonts w:ascii="Public Sans" w:hAnsi="Public Sans"/>
+                <w:b w:val="0"/>
+                <w:i w:val="0"/>
+                <w:color w:val="1F2833"/>
+                <w:sz w:val="21"/>
+              </w:rPr>
+              <w:t xml:space="preserve"> : endettement de 12,1 %, sous le seuil de 35 %</w:t>
+            </w:r>
+          </w:p>
+          <w:p>
+            <w:pPr>
+              <w:spacing w:before="120" w:after="0" w:line="240" w:lineRule="auto"/>
             </w:pPr>
             <w:r>
               <w:rPr>
@@ -12288,7 +12393,7 @@
                 <w:b w:val="0"/>
                 <w:i w:val="0"/>
                 <w:color w:val="5B6672"/>
-                <w:sz w:val="20"/>
+                <w:sz w:val="19"/>
               </w:rPr>
               <w:t>Enrichissement net estimé sur 20 ans : 46 082 € (cash-flows après impôts et revente nette, apport déduit).</w:t>
             </w:r>

</xml_diff>

<commit_message>
Test complet et relecture : compteur GoatCounter des vérifications réparé, endettement assurance comprise, tutoiement et « étape » partout, étape Dossier plus lisible, confidentialité et crédits IGN ; exemple de dossier régénéré
Co-Authored-By: Claude Opus 5.5 <noreply@anthropic.com>
</commit_message>
<xml_diff>
--- a/app/data/exemple-dossier/Exemple de dossier de financement.docx
+++ b/app/data/exemple-dossier/Exemple de dossier de financement.docx
@@ -6263,7 +6263,7 @@
                       <w:color w:val="5B6672"/>
                       <w:sz w:val="21"/>
                     </w:rPr>
-                    <w:t>Frais comptable annuel</w:t>
+                    <w:t>Frais de comptabilité annuels</w:t>
                   </w:r>
                 </w:p>
               </w:tc>
@@ -7250,7 +7250,7 @@
                       <w:color w:val="1F2833"/>
                       <w:sz w:val="22"/>
                     </w:rPr>
-                    <w:t>+0 €</w:t>
+                    <w:t>0 €</w:t>
                   </w:r>
                 </w:p>
               </w:tc>
@@ -11383,7 +11383,7 @@
                 <w:color w:val="2D6A4F"/>
                 <w:sz w:val="23"/>
               </w:rPr>
-              <w:t>Avec ce projet, le foyer est à 12,1 % d'endettement : 22,9 points sous le seuil de 35 %.</w:t>
+              <w:t>Avec ce projet, le foyer est à 12,5 % d'endettement : 22,5 points sous le seuil de 35 %.</w:t>
             </w:r>
           </w:p>
         </w:tc>
@@ -11460,7 +11460,7 @@
                 <w:color w:val="2D6A4F"/>
                 <w:sz w:val="34"/>
               </w:rPr>
-              <w:t>12,1 %</w:t>
+              <w:t>12,5 %</w:t>
             </w:r>
           </w:p>
         </w:tc>
@@ -11558,7 +11558,7 @@
                 <w:color w:val="2D6A4F"/>
                 <w:sz w:val="34"/>
               </w:rPr>
-              <w:t>1 140 €/mois</w:t>
+              <w:t>1 120 €/mois</w:t>
             </w:r>
           </w:p>
         </w:tc>
@@ -11630,7 +11630,7 @@
                       <w:color w:val="5B6672"/>
                       <w:sz w:val="21"/>
                     </w:rPr>
-                    <w:t>Mensualité du projet retenue (hors assurance)</w:t>
+                    <w:t>Mensualité du projet retenue (assurance comprise)</w:t>
                   </w:r>
                 </w:p>
               </w:tc>
@@ -11660,7 +11660,7 @@
                       <w:color w:val="1F2833"/>
                       <w:sz w:val="22"/>
                     </w:rPr>
-                    <w:t>400 €</w:t>
+                    <w:t>420 €</w:t>
                   </w:r>
                 </w:p>
               </w:tc>
@@ -11847,7 +11847,7 @@
                       <w:color w:val="1F2833"/>
                       <w:sz w:val="22"/>
                     </w:rPr>
-                    <w:t>600 €</w:t>
+                    <w:t>620 €</w:t>
                   </w:r>
                 </w:p>
               </w:tc>
@@ -11910,7 +11910,7 @@
                       <w:color w:val="1B3358"/>
                       <w:sz w:val="23"/>
                     </w:rPr>
-                    <w:t>12,1 %</w:t>
+                    <w:t>12,5 %</w:t>
                   </w:r>
                 </w:p>
               </w:tc>
@@ -12380,7 +12380,7 @@
                 <w:color w:val="1F2833"/>
                 <w:sz w:val="21"/>
               </w:rPr>
-              <w:t xml:space="preserve"> : endettement de 12,1 %, sous le seuil de 35 %</w:t>
+              <w:t xml:space="preserve"> : endettement de 12,5 %, sous le seuil de 35 %</w:t>
             </w:r>
           </w:p>
           <w:p>
@@ -12952,7 +12952,7 @@
                 <w:sz w:val="23"/>
               </w:rPr>
               <w:tab/>
-              <w:t>12,1 %</w:t>
+              <w:t>12,5 %</w:t>
             </w:r>
           </w:p>
         </w:tc>
@@ -14612,7 +14612,7 @@
     </w:p>
     <w:p>
       <w:r>
-        <w:t>Ce document est une estimation générée automatiquement à partir des hypothèses saisies par l'utilisateur (prix, loyers ou tarifs de location, charges, taux, durée...).</w:t>
+        <w:t>Ce document est une estimation générée automatiquement à partir des hypothèses saisies par l'utilisateur (prix, loyers ou tarifs de location, charges, taux, durée…).</w:t>
       </w:r>
     </w:p>
     <w:p>

</xml_diff>

<commit_message>
Dossier Word : fond bleuté unique pour les pages, les graphiques et les cartes (aussi à l'impression et en PDF), couleurs des tuiles et du zébrage ajustées ; exemple régénéré
Co-Authored-By: Claude Opus 5.5 <noreply@anthropic.com>
</commit_message>
<xml_diff>
--- a/app/data/exemple-dossier/Exemple de dossier de financement.docx
+++ b/app/data/exemple-dossier/Exemple de dossier de financement.docx
@@ -1,6 +1,7 @@
 
 <file path=word/document.xml><?xml version="1.0" encoding="utf-8"?>
 <w:document xmlns:wpc="http://schemas.microsoft.com/office/word/2010/wordprocessingCanvas" xmlns:mo="http://schemas.microsoft.com/office/mac/office/2008/main" xmlns:mc="http://schemas.openxmlformats.org/markup-compatibility/2006" xmlns:mv="urn:schemas-microsoft-com:mac:vml" xmlns:o="urn:schemas-microsoft-com:office:office" xmlns:r="http://schemas.openxmlformats.org/officeDocument/2006/relationships" xmlns:m="http://schemas.openxmlformats.org/officeDocument/2006/math" xmlns:v="urn:schemas-microsoft-com:vml" xmlns:wp14="http://schemas.microsoft.com/office/word/2010/wordprocessingDrawing" xmlns:wp="http://schemas.openxmlformats.org/drawingml/2006/wordprocessingDrawing" xmlns:w10="urn:schemas-microsoft-com:office:word" xmlns:w="http://schemas.openxmlformats.org/wordprocessingml/2006/main" xmlns:w14="http://schemas.microsoft.com/office/word/2010/wordml" xmlns:wpg="http://schemas.microsoft.com/office/word/2010/wordprocessingGroup" xmlns:wpi="http://schemas.microsoft.com/office/word/2010/wordprocessingInk" xmlns:wne="http://schemas.microsoft.com/office/word/2006/wordml" xmlns:wps="http://schemas.microsoft.com/office/word/2010/wordprocessingShape" mc:Ignorable="w14 wp14">
+  <w:background w:color="F5F7FA"/>
   <w:body>
     <w:tbl>
       <w:tblPr>
@@ -51,7 +52,7 @@
                           <pic:cNvPicPr/>
                         </pic:nvPicPr>
                         <pic:blipFill>
-                          <a:blip r:embed="rId11"/>
+                          <a:blip r:embed="rId12"/>
                           <a:stretch>
                             <a:fillRect/>
                           </a:stretch>
@@ -162,12 +163,12 @@
           <w:tcPr>
             <w:tcW w:type="dxa" w:w="3699"/>
             <w:vAlign w:val="center"/>
-            <w:shd w:val="clear" w:color="auto" w:fill="EEF2F7"/>
+            <w:shd w:val="clear" w:color="auto" w:fill="E6ECF3"/>
             <w:tcBorders>
               <w:top w:val="nil"/>
               <w:left w:val="single" w:sz="24" w:color="1B3358"/>
               <w:bottom w:val="nil"/>
-              <w:right w:val="single" w:sz="48" w:color="FFFFFF"/>
+              <w:right w:val="single" w:sz="48" w:color="F5F7FA"/>
             </w:tcBorders>
             <w:tcMar>
               <w:top w:w="110" w:type="dxa"/>
@@ -211,12 +212,12 @@
           <w:tcPr>
             <w:tcW w:type="dxa" w:w="3699"/>
             <w:vAlign w:val="center"/>
-            <w:shd w:val="clear" w:color="auto" w:fill="EEF2F7"/>
+            <w:shd w:val="clear" w:color="auto" w:fill="E6ECF3"/>
             <w:tcBorders>
               <w:top w:val="nil"/>
               <w:left w:val="single" w:sz="24" w:color="1B3358"/>
               <w:bottom w:val="nil"/>
-              <w:right w:val="single" w:sz="48" w:color="FFFFFF"/>
+              <w:right w:val="single" w:sz="48" w:color="F5F7FA"/>
             </w:tcBorders>
             <w:tcMar>
               <w:top w:w="110" w:type="dxa"/>
@@ -260,12 +261,12 @@
           <w:tcPr>
             <w:tcW w:type="dxa" w:w="3699"/>
             <w:vAlign w:val="center"/>
-            <w:shd w:val="clear" w:color="auto" w:fill="EEF2F7"/>
+            <w:shd w:val="clear" w:color="auto" w:fill="E6ECF3"/>
             <w:tcBorders>
               <w:top w:val="nil"/>
               <w:left w:val="single" w:sz="24" w:color="2D6A4F"/>
               <w:bottom w:val="nil"/>
-              <w:right w:val="single" w:sz="48" w:color="FFFFFF"/>
+              <w:right w:val="single" w:sz="48" w:color="F5F7FA"/>
             </w:tcBorders>
             <w:tcMar>
               <w:top w:w="110" w:type="dxa"/>
@@ -309,7 +310,7 @@
           <w:tcPr>
             <w:tcW w:type="dxa" w:w="3699"/>
             <w:vAlign w:val="center"/>
-            <w:shd w:val="clear" w:color="auto" w:fill="EEF2F7"/>
+            <w:shd w:val="clear" w:color="auto" w:fill="E6ECF3"/>
             <w:tcBorders>
               <w:top w:val="nil"/>
               <w:left w:val="single" w:sz="24" w:color="1B3358"/>
@@ -401,8 +402,9 @@
     <w:p>
       <w:pPr>
         <w:sectPr>
-          <w:headerReference w:type="default" r:id="rId9"/>
-          <w:footerReference w:type="default" r:id="rId10"/>
+          <w:headerReference w:type="first" r:id="rId9"/>
+          <w:headerReference w:type="default" r:id="rId10"/>
+          <w:footerReference w:type="default" r:id="rId11"/>
           <w:pgSz w:w="16838" w:h="11906" w:orient="landscape"/>
           <w:pgMar w:top="1020" w:right="1020" w:bottom="1020" w:left="1020" w:header="720" w:footer="340" w:gutter="0"/>
           <w:cols w:space="720"/>
@@ -1125,7 +1127,7 @@
                           <pic:cNvPicPr/>
                         </pic:nvPicPr>
                         <pic:blipFill>
-                          <a:blip r:embed="rId13"/>
+                          <a:blip r:embed="rId14"/>
                           <a:stretch>
                             <a:fillRect/>
                           </a:stretch>
@@ -1183,7 +1185,7 @@
                           <pic:cNvPicPr/>
                         </pic:nvPicPr>
                         <pic:blipFill>
-                          <a:blip r:embed="rId14"/>
+                          <a:blip r:embed="rId15"/>
                           <a:stretch>
                             <a:fillRect/>
                           </a:stretch>
@@ -1270,7 +1272,7 @@
         <w:tc>
           <w:tcPr>
             <w:tcW w:type="dxa" w:w="14797"/>
-            <w:shd w:val="clear" w:color="auto" w:fill="EEF2F7"/>
+            <w:shd w:val="clear" w:color="auto" w:fill="E6ECF3"/>
             <w:tcBorders>
               <w:top w:val="nil"/>
               <w:left w:val="single" w:sz="36" w:color="1B3358"/>
@@ -1374,7 +1376,7 @@
                           <pic:cNvPicPr/>
                         </pic:nvPicPr>
                         <pic:blipFill>
-                          <a:blip r:embed="rId15"/>
+                          <a:blip r:embed="rId16"/>
                           <a:stretch>
                             <a:fillRect/>
                           </a:stretch>
@@ -1426,7 +1428,7 @@
                           <pic:cNvPicPr/>
                         </pic:nvPicPr>
                         <pic:blipFill>
-                          <a:blip r:embed="rId16"/>
+                          <a:blip r:embed="rId17"/>
                           <a:stretch>
                             <a:fillRect/>
                           </a:stretch>
@@ -1464,7 +1466,7 @@
     <w:p>
       <w:pPr>
         <w:sectPr>
-          <w:footerReference w:type="default" r:id="rId12"/>
+          <w:footerReference w:type="default" r:id="rId13"/>
           <w:pgSz w:w="16838" w:h="11906" w:orient="landscape"/>
           <w:pgMar w:top="1020" w:right="1020" w:bottom="1020" w:left="1020" w:header="720" w:footer="340" w:gutter="0"/>
           <w:cols w:space="720"/>
@@ -1524,7 +1526,7 @@
                           <pic:cNvPicPr/>
                         </pic:nvPicPr>
                         <pic:blipFill>
-                          <a:blip r:embed="rId18"/>
+                          <a:blip r:embed="rId19"/>
                           <a:stretch>
                             <a:fillRect/>
                           </a:stretch>
@@ -1582,7 +1584,7 @@
                           <pic:cNvPicPr/>
                         </pic:nvPicPr>
                         <pic:blipFill>
-                          <a:blip r:embed="rId19"/>
+                          <a:blip r:embed="rId20"/>
                           <a:stretch>
                             <a:fillRect/>
                           </a:stretch>
@@ -1747,12 +1749,12 @@
           <w:tcPr>
             <w:tcW w:type="dxa" w:w="3699"/>
             <w:vAlign w:val="center"/>
-            <w:shd w:val="clear" w:color="auto" w:fill="EEF2F7"/>
+            <w:shd w:val="clear" w:color="auto" w:fill="E6ECF3"/>
             <w:tcBorders>
               <w:top w:val="nil"/>
               <w:left w:val="single" w:sz="24" w:color="1B3358"/>
               <w:bottom w:val="nil"/>
-              <w:right w:val="single" w:sz="48" w:color="FFFFFF"/>
+              <w:right w:val="single" w:sz="48" w:color="F5F7FA"/>
             </w:tcBorders>
             <w:tcMar>
               <w:top w:w="110" w:type="dxa"/>
@@ -1796,12 +1798,12 @@
           <w:tcPr>
             <w:tcW w:type="dxa" w:w="3699"/>
             <w:vAlign w:val="center"/>
-            <w:shd w:val="clear" w:color="auto" w:fill="EEF2F7"/>
+            <w:shd w:val="clear" w:color="auto" w:fill="E6ECF3"/>
             <w:tcBorders>
               <w:top w:val="nil"/>
               <w:left w:val="single" w:sz="24" w:color="1B3358"/>
               <w:bottom w:val="nil"/>
-              <w:right w:val="single" w:sz="48" w:color="FFFFFF"/>
+              <w:right w:val="single" w:sz="48" w:color="F5F7FA"/>
             </w:tcBorders>
             <w:tcMar>
               <w:top w:w="110" w:type="dxa"/>
@@ -1845,12 +1847,12 @@
           <w:tcPr>
             <w:tcW w:type="dxa" w:w="3699"/>
             <w:vAlign w:val="center"/>
-            <w:shd w:val="clear" w:color="auto" w:fill="EEF2F7"/>
+            <w:shd w:val="clear" w:color="auto" w:fill="E6ECF3"/>
             <w:tcBorders>
               <w:top w:val="nil"/>
               <w:left w:val="single" w:sz="24" w:color="2D6A4F"/>
               <w:bottom w:val="nil"/>
-              <w:right w:val="single" w:sz="48" w:color="FFFFFF"/>
+              <w:right w:val="single" w:sz="48" w:color="F5F7FA"/>
             </w:tcBorders>
             <w:tcMar>
               <w:top w:w="110" w:type="dxa"/>
@@ -1894,7 +1896,7 @@
           <w:tcPr>
             <w:tcW w:type="dxa" w:w="3699"/>
             <w:vAlign w:val="center"/>
-            <w:shd w:val="clear" w:color="auto" w:fill="EEF2F7"/>
+            <w:shd w:val="clear" w:color="auto" w:fill="E6ECF3"/>
             <w:tcBorders>
               <w:top w:val="nil"/>
               <w:left w:val="single" w:sz="24" w:color="B23A32"/>
@@ -2344,7 +2346,7 @@
                   <w:tcBorders>
                     <w:bottom w:val="single" w:sz="4" w:color="E1E6EC"/>
                   </w:tcBorders>
-                  <w:shd w:val="clear" w:color="auto" w:fill="F4F6FA"/>
+                  <w:shd w:val="clear" w:color="auto" w:fill="ECF0F5"/>
                   <w:tcMar>
                     <w:top w:w="25" w:type="dxa"/>
                     <w:bottom w:w="25" w:type="dxa"/>
@@ -2375,7 +2377,7 @@
                   <w:tcBorders>
                     <w:bottom w:val="single" w:sz="4" w:color="E1E6EC"/>
                   </w:tcBorders>
-                  <w:shd w:val="clear" w:color="auto" w:fill="F4F6FA"/>
+                  <w:shd w:val="clear" w:color="auto" w:fill="ECF0F5"/>
                   <w:tcMar>
                     <w:top w:w="25" w:type="dxa"/>
                     <w:bottom w:w="25" w:type="dxa"/>
@@ -2406,7 +2408,7 @@
                   <w:tcBorders>
                     <w:bottom w:val="single" w:sz="4" w:color="E1E6EC"/>
                   </w:tcBorders>
-                  <w:shd w:val="clear" w:color="auto" w:fill="F4F6FA"/>
+                  <w:shd w:val="clear" w:color="auto" w:fill="ECF0F5"/>
                   <w:tcMar>
                     <w:top w:w="25" w:type="dxa"/>
                     <w:bottom w:w="25" w:type="dxa"/>
@@ -2437,7 +2439,7 @@
                   <w:tcBorders>
                     <w:bottom w:val="single" w:sz="4" w:color="E1E6EC"/>
                   </w:tcBorders>
-                  <w:shd w:val="clear" w:color="auto" w:fill="F4F6FA"/>
+                  <w:shd w:val="clear" w:color="auto" w:fill="ECF0F5"/>
                   <w:tcMar>
                     <w:top w:w="25" w:type="dxa"/>
                     <w:bottom w:w="25" w:type="dxa"/>
@@ -2468,7 +2470,7 @@
                   <w:tcBorders>
                     <w:bottom w:val="single" w:sz="4" w:color="E1E6EC"/>
                   </w:tcBorders>
-                  <w:shd w:val="clear" w:color="auto" w:fill="F4F6FA"/>
+                  <w:shd w:val="clear" w:color="auto" w:fill="ECF0F5"/>
                   <w:tcMar>
                     <w:top w:w="25" w:type="dxa"/>
                     <w:bottom w:w="25" w:type="dxa"/>
@@ -2499,7 +2501,7 @@
                   <w:tcBorders>
                     <w:bottom w:val="single" w:sz="4" w:color="E1E6EC"/>
                   </w:tcBorders>
-                  <w:shd w:val="clear" w:color="auto" w:fill="F4F6FA"/>
+                  <w:shd w:val="clear" w:color="auto" w:fill="ECF0F5"/>
                   <w:tcMar>
                     <w:top w:w="25" w:type="dxa"/>
                     <w:bottom w:w="25" w:type="dxa"/>
@@ -2714,7 +2716,7 @@
                   <w:tcBorders>
                     <w:bottom w:val="single" w:sz="4" w:color="E1E6EC"/>
                   </w:tcBorders>
-                  <w:shd w:val="clear" w:color="auto" w:fill="F4F6FA"/>
+                  <w:shd w:val="clear" w:color="auto" w:fill="ECF0F5"/>
                   <w:tcMar>
                     <w:top w:w="25" w:type="dxa"/>
                     <w:bottom w:w="25" w:type="dxa"/>
@@ -2745,7 +2747,7 @@
                   <w:tcBorders>
                     <w:bottom w:val="single" w:sz="4" w:color="E1E6EC"/>
                   </w:tcBorders>
-                  <w:shd w:val="clear" w:color="auto" w:fill="F4F6FA"/>
+                  <w:shd w:val="clear" w:color="auto" w:fill="ECF0F5"/>
                   <w:tcMar>
                     <w:top w:w="25" w:type="dxa"/>
                     <w:bottom w:w="25" w:type="dxa"/>
@@ -2776,7 +2778,7 @@
                   <w:tcBorders>
                     <w:bottom w:val="single" w:sz="4" w:color="E1E6EC"/>
                   </w:tcBorders>
-                  <w:shd w:val="clear" w:color="auto" w:fill="F4F6FA"/>
+                  <w:shd w:val="clear" w:color="auto" w:fill="ECF0F5"/>
                   <w:tcMar>
                     <w:top w:w="25" w:type="dxa"/>
                     <w:bottom w:w="25" w:type="dxa"/>
@@ -2807,7 +2809,7 @@
                   <w:tcBorders>
                     <w:bottom w:val="single" w:sz="4" w:color="E1E6EC"/>
                   </w:tcBorders>
-                  <w:shd w:val="clear" w:color="auto" w:fill="F4F6FA"/>
+                  <w:shd w:val="clear" w:color="auto" w:fill="ECF0F5"/>
                   <w:tcMar>
                     <w:top w:w="25" w:type="dxa"/>
                     <w:bottom w:w="25" w:type="dxa"/>
@@ -2838,7 +2840,7 @@
                   <w:tcBorders>
                     <w:bottom w:val="single" w:sz="4" w:color="E1E6EC"/>
                   </w:tcBorders>
-                  <w:shd w:val="clear" w:color="auto" w:fill="F4F6FA"/>
+                  <w:shd w:val="clear" w:color="auto" w:fill="ECF0F5"/>
                   <w:tcMar>
                     <w:top w:w="25" w:type="dxa"/>
                     <w:bottom w:w="25" w:type="dxa"/>
@@ -2869,7 +2871,7 @@
                   <w:tcBorders>
                     <w:bottom w:val="single" w:sz="4" w:color="E1E6EC"/>
                   </w:tcBorders>
-                  <w:shd w:val="clear" w:color="auto" w:fill="F4F6FA"/>
+                  <w:shd w:val="clear" w:color="auto" w:fill="ECF0F5"/>
                   <w:tcMar>
                     <w:top w:w="25" w:type="dxa"/>
                     <w:bottom w:w="25" w:type="dxa"/>
@@ -3084,7 +3086,7 @@
                   <w:tcBorders>
                     <w:bottom w:val="single" w:sz="4" w:color="E1E6EC"/>
                   </w:tcBorders>
-                  <w:shd w:val="clear" w:color="auto" w:fill="F4F6FA"/>
+                  <w:shd w:val="clear" w:color="auto" w:fill="ECF0F5"/>
                   <w:tcMar>
                     <w:top w:w="25" w:type="dxa"/>
                     <w:bottom w:w="25" w:type="dxa"/>
@@ -3115,7 +3117,7 @@
                   <w:tcBorders>
                     <w:bottom w:val="single" w:sz="4" w:color="E1E6EC"/>
                   </w:tcBorders>
-                  <w:shd w:val="clear" w:color="auto" w:fill="F4F6FA"/>
+                  <w:shd w:val="clear" w:color="auto" w:fill="ECF0F5"/>
                   <w:tcMar>
                     <w:top w:w="25" w:type="dxa"/>
                     <w:bottom w:w="25" w:type="dxa"/>
@@ -3146,7 +3148,7 @@
                   <w:tcBorders>
                     <w:bottom w:val="single" w:sz="4" w:color="E1E6EC"/>
                   </w:tcBorders>
-                  <w:shd w:val="clear" w:color="auto" w:fill="F4F6FA"/>
+                  <w:shd w:val="clear" w:color="auto" w:fill="ECF0F5"/>
                   <w:tcMar>
                     <w:top w:w="25" w:type="dxa"/>
                     <w:bottom w:w="25" w:type="dxa"/>
@@ -3177,7 +3179,7 @@
                   <w:tcBorders>
                     <w:bottom w:val="single" w:sz="4" w:color="E1E6EC"/>
                   </w:tcBorders>
-                  <w:shd w:val="clear" w:color="auto" w:fill="F4F6FA"/>
+                  <w:shd w:val="clear" w:color="auto" w:fill="ECF0F5"/>
                   <w:tcMar>
                     <w:top w:w="25" w:type="dxa"/>
                     <w:bottom w:w="25" w:type="dxa"/>
@@ -3208,7 +3210,7 @@
                   <w:tcBorders>
                     <w:bottom w:val="single" w:sz="4" w:color="E1E6EC"/>
                   </w:tcBorders>
-                  <w:shd w:val="clear" w:color="auto" w:fill="F4F6FA"/>
+                  <w:shd w:val="clear" w:color="auto" w:fill="ECF0F5"/>
                   <w:tcMar>
                     <w:top w:w="25" w:type="dxa"/>
                     <w:bottom w:w="25" w:type="dxa"/>
@@ -3239,7 +3241,7 @@
                   <w:tcBorders>
                     <w:bottom w:val="single" w:sz="4" w:color="E1E6EC"/>
                   </w:tcBorders>
-                  <w:shd w:val="clear" w:color="auto" w:fill="F4F6FA"/>
+                  <w:shd w:val="clear" w:color="auto" w:fill="ECF0F5"/>
                   <w:tcMar>
                     <w:top w:w="25" w:type="dxa"/>
                     <w:bottom w:w="25" w:type="dxa"/>
@@ -3454,7 +3456,7 @@
                   <w:tcBorders>
                     <w:bottom w:val="single" w:sz="4" w:color="E1E6EC"/>
                   </w:tcBorders>
-                  <w:shd w:val="clear" w:color="auto" w:fill="F4F6FA"/>
+                  <w:shd w:val="clear" w:color="auto" w:fill="ECF0F5"/>
                   <w:tcMar>
                     <w:top w:w="25" w:type="dxa"/>
                     <w:bottom w:w="25" w:type="dxa"/>
@@ -3485,7 +3487,7 @@
                   <w:tcBorders>
                     <w:bottom w:val="single" w:sz="4" w:color="E1E6EC"/>
                   </w:tcBorders>
-                  <w:shd w:val="clear" w:color="auto" w:fill="F4F6FA"/>
+                  <w:shd w:val="clear" w:color="auto" w:fill="ECF0F5"/>
                   <w:tcMar>
                     <w:top w:w="25" w:type="dxa"/>
                     <w:bottom w:w="25" w:type="dxa"/>
@@ -3516,7 +3518,7 @@
                   <w:tcBorders>
                     <w:bottom w:val="single" w:sz="4" w:color="E1E6EC"/>
                   </w:tcBorders>
-                  <w:shd w:val="clear" w:color="auto" w:fill="F4F6FA"/>
+                  <w:shd w:val="clear" w:color="auto" w:fill="ECF0F5"/>
                   <w:tcMar>
                     <w:top w:w="25" w:type="dxa"/>
                     <w:bottom w:w="25" w:type="dxa"/>
@@ -3547,7 +3549,7 @@
                   <w:tcBorders>
                     <w:bottom w:val="single" w:sz="4" w:color="E1E6EC"/>
                   </w:tcBorders>
-                  <w:shd w:val="clear" w:color="auto" w:fill="F4F6FA"/>
+                  <w:shd w:val="clear" w:color="auto" w:fill="ECF0F5"/>
                   <w:tcMar>
                     <w:top w:w="25" w:type="dxa"/>
                     <w:bottom w:w="25" w:type="dxa"/>
@@ -3578,7 +3580,7 @@
                   <w:tcBorders>
                     <w:bottom w:val="single" w:sz="4" w:color="E1E6EC"/>
                   </w:tcBorders>
-                  <w:shd w:val="clear" w:color="auto" w:fill="F4F6FA"/>
+                  <w:shd w:val="clear" w:color="auto" w:fill="ECF0F5"/>
                   <w:tcMar>
                     <w:top w:w="25" w:type="dxa"/>
                     <w:bottom w:w="25" w:type="dxa"/>
@@ -3609,7 +3611,7 @@
                   <w:tcBorders>
                     <w:bottom w:val="single" w:sz="4" w:color="E1E6EC"/>
                   </w:tcBorders>
-                  <w:shd w:val="clear" w:color="auto" w:fill="F4F6FA"/>
+                  <w:shd w:val="clear" w:color="auto" w:fill="ECF0F5"/>
                   <w:tcMar>
                     <w:top w:w="25" w:type="dxa"/>
                     <w:bottom w:w="25" w:type="dxa"/>
@@ -3824,7 +3826,7 @@
                   <w:tcBorders>
                     <w:bottom w:val="single" w:sz="4" w:color="E1E6EC"/>
                   </w:tcBorders>
-                  <w:shd w:val="clear" w:color="auto" w:fill="F4F6FA"/>
+                  <w:shd w:val="clear" w:color="auto" w:fill="ECF0F5"/>
                   <w:tcMar>
                     <w:top w:w="25" w:type="dxa"/>
                     <w:bottom w:w="25" w:type="dxa"/>
@@ -3855,7 +3857,7 @@
                   <w:tcBorders>
                     <w:bottom w:val="single" w:sz="4" w:color="E1E6EC"/>
                   </w:tcBorders>
-                  <w:shd w:val="clear" w:color="auto" w:fill="F4F6FA"/>
+                  <w:shd w:val="clear" w:color="auto" w:fill="ECF0F5"/>
                   <w:tcMar>
                     <w:top w:w="25" w:type="dxa"/>
                     <w:bottom w:w="25" w:type="dxa"/>
@@ -3886,7 +3888,7 @@
                   <w:tcBorders>
                     <w:bottom w:val="single" w:sz="4" w:color="E1E6EC"/>
                   </w:tcBorders>
-                  <w:shd w:val="clear" w:color="auto" w:fill="F4F6FA"/>
+                  <w:shd w:val="clear" w:color="auto" w:fill="ECF0F5"/>
                   <w:tcMar>
                     <w:top w:w="25" w:type="dxa"/>
                     <w:bottom w:w="25" w:type="dxa"/>
@@ -3917,7 +3919,7 @@
                   <w:tcBorders>
                     <w:bottom w:val="single" w:sz="4" w:color="E1E6EC"/>
                   </w:tcBorders>
-                  <w:shd w:val="clear" w:color="auto" w:fill="F4F6FA"/>
+                  <w:shd w:val="clear" w:color="auto" w:fill="ECF0F5"/>
                   <w:tcMar>
                     <w:top w:w="25" w:type="dxa"/>
                     <w:bottom w:w="25" w:type="dxa"/>
@@ -3948,7 +3950,7 @@
                   <w:tcBorders>
                     <w:bottom w:val="single" w:sz="4" w:color="E1E6EC"/>
                   </w:tcBorders>
-                  <w:shd w:val="clear" w:color="auto" w:fill="F4F6FA"/>
+                  <w:shd w:val="clear" w:color="auto" w:fill="ECF0F5"/>
                   <w:tcMar>
                     <w:top w:w="25" w:type="dxa"/>
                     <w:bottom w:w="25" w:type="dxa"/>
@@ -3979,7 +3981,7 @@
                   <w:tcBorders>
                     <w:bottom w:val="single" w:sz="4" w:color="E1E6EC"/>
                   </w:tcBorders>
-                  <w:shd w:val="clear" w:color="auto" w:fill="F4F6FA"/>
+                  <w:shd w:val="clear" w:color="auto" w:fill="ECF0F5"/>
                   <w:tcMar>
                     <w:top w:w="25" w:type="dxa"/>
                     <w:bottom w:w="25" w:type="dxa"/>
@@ -4033,7 +4035,7 @@
                           <pic:cNvPicPr/>
                         </pic:nvPicPr>
                         <pic:blipFill>
-                          <a:blip r:embed="rId20"/>
+                          <a:blip r:embed="rId21"/>
                           <a:stretch>
                             <a:fillRect/>
                           </a:stretch>
@@ -4071,7 +4073,7 @@
     <w:p>
       <w:pPr>
         <w:sectPr>
-          <w:footerReference w:type="default" r:id="rId17"/>
+          <w:footerReference w:type="default" r:id="rId18"/>
           <w:pgSz w:w="16838" w:h="11906" w:orient="landscape"/>
           <w:pgMar w:top="1020" w:right="1020" w:bottom="1020" w:left="1020" w:header="720" w:footer="340" w:gutter="0"/>
           <w:cols w:space="720"/>
@@ -4131,7 +4133,7 @@
                           <pic:cNvPicPr/>
                         </pic:nvPicPr>
                         <pic:blipFill>
-                          <a:blip r:embed="rId22"/>
+                          <a:blip r:embed="rId23"/>
                           <a:stretch>
                             <a:fillRect/>
                           </a:stretch>
@@ -4189,7 +4191,7 @@
                           <pic:cNvPicPr/>
                         </pic:nvPicPr>
                         <pic:blipFill>
-                          <a:blip r:embed="rId23"/>
+                          <a:blip r:embed="rId24"/>
                           <a:stretch>
                             <a:fillRect/>
                           </a:stretch>
@@ -4276,7 +4278,7 @@
         <w:tc>
           <w:tcPr>
             <w:tcW w:type="dxa" w:w="14797"/>
-            <w:shd w:val="clear" w:color="auto" w:fill="EEF2F7"/>
+            <w:shd w:val="clear" w:color="auto" w:fill="E6ECF3"/>
             <w:tcBorders>
               <w:top w:val="nil"/>
               <w:left w:val="single" w:sz="36" w:color="1B3358"/>
@@ -4353,12 +4355,12 @@
           <w:tcPr>
             <w:tcW w:type="dxa" w:w="4932"/>
             <w:vAlign w:val="center"/>
-            <w:shd w:val="clear" w:color="auto" w:fill="EEF2F7"/>
+            <w:shd w:val="clear" w:color="auto" w:fill="E6ECF3"/>
             <w:tcBorders>
               <w:top w:val="nil"/>
               <w:left w:val="single" w:sz="24" w:color="1B3358"/>
               <w:bottom w:val="nil"/>
-              <w:right w:val="single" w:sz="48" w:color="FFFFFF"/>
+              <w:right w:val="single" w:sz="48" w:color="F5F7FA"/>
             </w:tcBorders>
             <w:tcMar>
               <w:top w:w="110" w:type="dxa"/>
@@ -4402,12 +4404,12 @@
           <w:tcPr>
             <w:tcW w:type="dxa" w:w="4932"/>
             <w:vAlign w:val="center"/>
-            <w:shd w:val="clear" w:color="auto" w:fill="EEF2F7"/>
+            <w:shd w:val="clear" w:color="auto" w:fill="E6ECF3"/>
             <w:tcBorders>
               <w:top w:val="nil"/>
               <w:left w:val="single" w:sz="24" w:color="1B3358"/>
               <w:bottom w:val="nil"/>
-              <w:right w:val="single" w:sz="48" w:color="FFFFFF"/>
+              <w:right w:val="single" w:sz="48" w:color="F5F7FA"/>
             </w:tcBorders>
             <w:tcMar>
               <w:top w:w="110" w:type="dxa"/>
@@ -4451,7 +4453,7 @@
           <w:tcPr>
             <w:tcW w:type="dxa" w:w="4932"/>
             <w:vAlign w:val="center"/>
-            <w:shd w:val="clear" w:color="auto" w:fill="EEF2F7"/>
+            <w:shd w:val="clear" w:color="auto" w:fill="E6ECF3"/>
             <w:tcBorders>
               <w:top w:val="nil"/>
               <w:left w:val="single" w:sz="24" w:color="1B3358"/>
@@ -4612,7 +4614,7 @@
                   <w:tcBorders>
                     <w:bottom w:val="single" w:sz="4" w:color="E1E6EC"/>
                   </w:tcBorders>
-                  <w:shd w:val="clear" w:color="auto" w:fill="F4F6FA"/>
+                  <w:shd w:val="clear" w:color="auto" w:fill="ECF0F5"/>
                 </w:tcPr>
                 <w:p>
                   <w:pPr>
@@ -4642,7 +4644,7 @@
                   <w:tcBorders>
                     <w:bottom w:val="single" w:sz="4" w:color="E1E6EC"/>
                   </w:tcBorders>
-                  <w:shd w:val="clear" w:color="auto" w:fill="F4F6FA"/>
+                  <w:shd w:val="clear" w:color="auto" w:fill="ECF0F5"/>
                 </w:tcPr>
                 <w:p>
                   <w:pPr>
@@ -4736,7 +4738,7 @@
                   <w:tcBorders>
                     <w:bottom w:val="single" w:sz="4" w:color="E1E6EC"/>
                   </w:tcBorders>
-                  <w:shd w:val="clear" w:color="auto" w:fill="F4F6FA"/>
+                  <w:shd w:val="clear" w:color="auto" w:fill="ECF0F5"/>
                 </w:tcPr>
                 <w:p>
                   <w:pPr>
@@ -4766,7 +4768,7 @@
                   <w:tcBorders>
                     <w:bottom w:val="single" w:sz="4" w:color="E1E6EC"/>
                   </w:tcBorders>
-                  <w:shd w:val="clear" w:color="auto" w:fill="F4F6FA"/>
+                  <w:shd w:val="clear" w:color="auto" w:fill="ECF0F5"/>
                 </w:tcPr>
                 <w:p>
                   <w:pPr>
@@ -4860,7 +4862,7 @@
                   <w:tcBorders>
                     <w:bottom w:val="single" w:sz="4" w:color="E1E6EC"/>
                   </w:tcBorders>
-                  <w:shd w:val="clear" w:color="auto" w:fill="F4F6FA"/>
+                  <w:shd w:val="clear" w:color="auto" w:fill="ECF0F5"/>
                 </w:tcPr>
                 <w:p>
                   <w:pPr>
@@ -4890,7 +4892,7 @@
                   <w:tcBorders>
                     <w:bottom w:val="single" w:sz="4" w:color="E1E6EC"/>
                   </w:tcBorders>
-                  <w:shd w:val="clear" w:color="auto" w:fill="F4F6FA"/>
+                  <w:shd w:val="clear" w:color="auto" w:fill="ECF0F5"/>
                 </w:tcPr>
                 <w:p>
                   <w:pPr>
@@ -4984,7 +4986,7 @@
                   <w:tcBorders>
                     <w:bottom w:val="single" w:sz="4" w:color="E1E6EC"/>
                   </w:tcBorders>
-                  <w:shd w:val="clear" w:color="auto" w:fill="F4F6FA"/>
+                  <w:shd w:val="clear" w:color="auto" w:fill="ECF0F5"/>
                 </w:tcPr>
                 <w:p>
                   <w:pPr>
@@ -5014,7 +5016,7 @@
                   <w:tcBorders>
                     <w:bottom w:val="single" w:sz="4" w:color="E1E6EC"/>
                   </w:tcBorders>
-                  <w:shd w:val="clear" w:color="auto" w:fill="F4F6FA"/>
+                  <w:shd w:val="clear" w:color="auto" w:fill="ECF0F5"/>
                 </w:tcPr>
                 <w:p>
                   <w:pPr>
@@ -5108,7 +5110,7 @@
                   <w:tcBorders>
                     <w:bottom w:val="single" w:sz="8" w:color="1B3358"/>
                   </w:tcBorders>
-                  <w:shd w:val="clear" w:color="auto" w:fill="EEF2F7"/>
+                  <w:shd w:val="clear" w:color="auto" w:fill="E6ECF3"/>
                 </w:tcPr>
                 <w:p>
                   <w:pPr>
@@ -5138,7 +5140,7 @@
                   <w:tcBorders>
                     <w:bottom w:val="single" w:sz="8" w:color="1B3358"/>
                   </w:tcBorders>
-                  <w:shd w:val="clear" w:color="auto" w:fill="EEF2F7"/>
+                  <w:shd w:val="clear" w:color="auto" w:fill="E6ECF3"/>
                 </w:tcPr>
                 <w:p>
                   <w:pPr>
@@ -5247,7 +5249,7 @@
                           <pic:cNvPicPr/>
                         </pic:nvPicPr>
                         <pic:blipFill>
-                          <a:blip r:embed="rId24"/>
+                          <a:blip r:embed="rId25"/>
                           <a:stretch>
                             <a:fillRect/>
                           </a:stretch>
@@ -5272,7 +5274,7 @@
     <w:p>
       <w:pPr>
         <w:sectPr>
-          <w:footerReference w:type="default" r:id="rId21"/>
+          <w:footerReference w:type="default" r:id="rId22"/>
           <w:pgSz w:w="16838" w:h="11906" w:orient="landscape"/>
           <w:pgMar w:top="1020" w:right="1020" w:bottom="1020" w:left="1020" w:header="720" w:footer="340" w:gutter="0"/>
           <w:cols w:space="720"/>
@@ -5332,7 +5334,7 @@
                           <pic:cNvPicPr/>
                         </pic:nvPicPr>
                         <pic:blipFill>
-                          <a:blip r:embed="rId26"/>
+                          <a:blip r:embed="rId27"/>
                           <a:stretch>
                             <a:fillRect/>
                           </a:stretch>
@@ -5390,7 +5392,7 @@
                           <pic:cNvPicPr/>
                         </pic:nvPicPr>
                         <pic:blipFill>
-                          <a:blip r:embed="rId27"/>
+                          <a:blip r:embed="rId28"/>
                           <a:stretch>
                             <a:fillRect/>
                           </a:stretch>
@@ -5554,12 +5556,12 @@
           <w:tcPr>
             <w:tcW w:type="dxa" w:w="4932"/>
             <w:vAlign w:val="center"/>
-            <w:shd w:val="clear" w:color="auto" w:fill="EEF2F7"/>
+            <w:shd w:val="clear" w:color="auto" w:fill="E6ECF3"/>
             <w:tcBorders>
               <w:top w:val="nil"/>
               <w:left w:val="single" w:sz="24" w:color="1B3358"/>
               <w:bottom w:val="nil"/>
-              <w:right w:val="single" w:sz="48" w:color="FFFFFF"/>
+              <w:right w:val="single" w:sz="48" w:color="F5F7FA"/>
             </w:tcBorders>
             <w:tcMar>
               <w:top w:w="110" w:type="dxa"/>
@@ -5603,12 +5605,12 @@
           <w:tcPr>
             <w:tcW w:type="dxa" w:w="4932"/>
             <w:vAlign w:val="center"/>
-            <w:shd w:val="clear" w:color="auto" w:fill="EEF2F7"/>
+            <w:shd w:val="clear" w:color="auto" w:fill="E6ECF3"/>
             <w:tcBorders>
               <w:top w:val="nil"/>
               <w:left w:val="single" w:sz="24" w:color="1B3358"/>
               <w:bottom w:val="nil"/>
-              <w:right w:val="single" w:sz="48" w:color="FFFFFF"/>
+              <w:right w:val="single" w:sz="48" w:color="F5F7FA"/>
             </w:tcBorders>
             <w:tcMar>
               <w:top w:w="110" w:type="dxa"/>
@@ -5652,7 +5654,7 @@
           <w:tcPr>
             <w:tcW w:type="dxa" w:w="4932"/>
             <w:vAlign w:val="center"/>
-            <w:shd w:val="clear" w:color="auto" w:fill="EEF2F7"/>
+            <w:shd w:val="clear" w:color="auto" w:fill="E6ECF3"/>
             <w:tcBorders>
               <w:top w:val="nil"/>
               <w:left w:val="single" w:sz="24" w:color="2D6A4F"/>
@@ -5813,7 +5815,7 @@
                   <w:tcBorders>
                     <w:bottom w:val="single" w:sz="4" w:color="E1E6EC"/>
                   </w:tcBorders>
-                  <w:shd w:val="clear" w:color="auto" w:fill="F4F6FA"/>
+                  <w:shd w:val="clear" w:color="auto" w:fill="ECF0F5"/>
                 </w:tcPr>
                 <w:p>
                   <w:pPr>
@@ -5843,7 +5845,7 @@
                   <w:tcBorders>
                     <w:bottom w:val="single" w:sz="4" w:color="E1E6EC"/>
                   </w:tcBorders>
-                  <w:shd w:val="clear" w:color="auto" w:fill="F4F6FA"/>
+                  <w:shd w:val="clear" w:color="auto" w:fill="ECF0F5"/>
                 </w:tcPr>
                 <w:p>
                   <w:pPr>
@@ -5876,7 +5878,7 @@
                   <w:tcBorders>
                     <w:bottom w:val="single" w:sz="8" w:color="1B3358"/>
                   </w:tcBorders>
-                  <w:shd w:val="clear" w:color="auto" w:fill="EEF2F7"/>
+                  <w:shd w:val="clear" w:color="auto" w:fill="E6ECF3"/>
                 </w:tcPr>
                 <w:p>
                   <w:pPr>
@@ -5906,7 +5908,7 @@
                   <w:tcBorders>
                     <w:bottom w:val="single" w:sz="8" w:color="1B3358"/>
                   </w:tcBorders>
-                  <w:shd w:val="clear" w:color="auto" w:fill="EEF2F7"/>
+                  <w:shd w:val="clear" w:color="auto" w:fill="E6ECF3"/>
                 </w:tcPr>
                 <w:p>
                   <w:pPr>
@@ -5939,7 +5941,7 @@
                   <w:tcBorders>
                     <w:bottom w:val="single" w:sz="4" w:color="E1E6EC"/>
                   </w:tcBorders>
-                  <w:shd w:val="clear" w:color="auto" w:fill="F4F6FA"/>
+                  <w:shd w:val="clear" w:color="auto" w:fill="ECF0F5"/>
                 </w:tcPr>
                 <w:p>
                   <w:pPr>
@@ -5969,7 +5971,7 @@
                   <w:tcBorders>
                     <w:bottom w:val="single" w:sz="4" w:color="E1E6EC"/>
                   </w:tcBorders>
-                  <w:shd w:val="clear" w:color="auto" w:fill="F4F6FA"/>
+                  <w:shd w:val="clear" w:color="auto" w:fill="ECF0F5"/>
                 </w:tcPr>
                 <w:p>
                   <w:pPr>
@@ -6063,7 +6065,7 @@
                   <w:tcBorders>
                     <w:bottom w:val="single" w:sz="4" w:color="E1E6EC"/>
                   </w:tcBorders>
-                  <w:shd w:val="clear" w:color="auto" w:fill="F4F6FA"/>
+                  <w:shd w:val="clear" w:color="auto" w:fill="ECF0F5"/>
                 </w:tcPr>
                 <w:p>
                   <w:pPr>
@@ -6093,7 +6095,7 @@
                   <w:tcBorders>
                     <w:bottom w:val="single" w:sz="4" w:color="E1E6EC"/>
                   </w:tcBorders>
-                  <w:shd w:val="clear" w:color="auto" w:fill="F4F6FA"/>
+                  <w:shd w:val="clear" w:color="auto" w:fill="ECF0F5"/>
                 </w:tcPr>
                 <w:p>
                   <w:pPr>
@@ -6187,7 +6189,7 @@
                   <w:tcBorders>
                     <w:bottom w:val="single" w:sz="4" w:color="E1E6EC"/>
                   </w:tcBorders>
-                  <w:shd w:val="clear" w:color="auto" w:fill="F4F6FA"/>
+                  <w:shd w:val="clear" w:color="auto" w:fill="ECF0F5"/>
                 </w:tcPr>
                 <w:p>
                   <w:pPr>
@@ -6217,7 +6219,7 @@
                   <w:tcBorders>
                     <w:bottom w:val="single" w:sz="4" w:color="E1E6EC"/>
                   </w:tcBorders>
-                  <w:shd w:val="clear" w:color="auto" w:fill="F4F6FA"/>
+                  <w:shd w:val="clear" w:color="auto" w:fill="ECF0F5"/>
                 </w:tcPr>
                 <w:p>
                   <w:pPr>
@@ -6311,7 +6313,7 @@
                   <w:tcBorders>
                     <w:bottom w:val="single" w:sz="4" w:color="E1E6EC"/>
                   </w:tcBorders>
-                  <w:shd w:val="clear" w:color="auto" w:fill="F4F6FA"/>
+                  <w:shd w:val="clear" w:color="auto" w:fill="ECF0F5"/>
                 </w:tcPr>
                 <w:p>
                   <w:pPr>
@@ -6341,7 +6343,7 @@
                   <w:tcBorders>
                     <w:bottom w:val="single" w:sz="4" w:color="E1E6EC"/>
                   </w:tcBorders>
-                  <w:shd w:val="clear" w:color="auto" w:fill="F4F6FA"/>
+                  <w:shd w:val="clear" w:color="auto" w:fill="ECF0F5"/>
                 </w:tcPr>
                 <w:p>
                   <w:pPr>
@@ -6374,7 +6376,7 @@
                   <w:tcBorders>
                     <w:bottom w:val="single" w:sz="8" w:color="1B3358"/>
                   </w:tcBorders>
-                  <w:shd w:val="clear" w:color="auto" w:fill="EEF2F7"/>
+                  <w:shd w:val="clear" w:color="auto" w:fill="E6ECF3"/>
                 </w:tcPr>
                 <w:p>
                   <w:pPr>
@@ -6404,7 +6406,7 @@
                   <w:tcBorders>
                     <w:bottom w:val="single" w:sz="8" w:color="1B3358"/>
                   </w:tcBorders>
-                  <w:shd w:val="clear" w:color="auto" w:fill="EEF2F7"/>
+                  <w:shd w:val="clear" w:color="auto" w:fill="E6ECF3"/>
                 </w:tcPr>
                 <w:p>
                   <w:pPr>
@@ -6437,7 +6439,7 @@
                   <w:tcBorders>
                     <w:bottom w:val="single" w:sz="4" w:color="E1E6EC"/>
                   </w:tcBorders>
-                  <w:shd w:val="clear" w:color="auto" w:fill="F4F6FA"/>
+                  <w:shd w:val="clear" w:color="auto" w:fill="ECF0F5"/>
                 </w:tcPr>
                 <w:p>
                   <w:pPr>
@@ -6467,7 +6469,7 @@
                   <w:tcBorders>
                     <w:bottom w:val="single" w:sz="4" w:color="E1E6EC"/>
                   </w:tcBorders>
-                  <w:shd w:val="clear" w:color="auto" w:fill="F4F6FA"/>
+                  <w:shd w:val="clear" w:color="auto" w:fill="ECF0F5"/>
                 </w:tcPr>
                 <w:p>
                   <w:pPr>
@@ -6515,7 +6517,7 @@
                           <pic:cNvPicPr/>
                         </pic:nvPicPr>
                         <pic:blipFill>
-                          <a:blip r:embed="rId28"/>
+                          <a:blip r:embed="rId29"/>
                           <a:stretch>
                             <a:fillRect/>
                           </a:stretch>
@@ -6540,7 +6542,7 @@
     <w:p>
       <w:pPr>
         <w:sectPr>
-          <w:footerReference w:type="default" r:id="rId25"/>
+          <w:footerReference w:type="default" r:id="rId26"/>
           <w:pgSz w:w="16838" w:h="11906" w:orient="landscape"/>
           <w:pgMar w:top="1020" w:right="1020" w:bottom="1020" w:left="1020" w:header="720" w:footer="340" w:gutter="0"/>
           <w:cols w:space="720"/>
@@ -6600,7 +6602,7 @@
                           <pic:cNvPicPr/>
                         </pic:nvPicPr>
                         <pic:blipFill>
-                          <a:blip r:embed="rId30"/>
+                          <a:blip r:embed="rId31"/>
                           <a:stretch>
                             <a:fillRect/>
                           </a:stretch>
@@ -6658,7 +6660,7 @@
                           <pic:cNvPicPr/>
                         </pic:nvPicPr>
                         <pic:blipFill>
-                          <a:blip r:embed="rId31"/>
+                          <a:blip r:embed="rId32"/>
                           <a:stretch>
                             <a:fillRect/>
                           </a:stretch>
@@ -6822,12 +6824,12 @@
           <w:tcPr>
             <w:tcW w:type="dxa" w:w="4932"/>
             <w:vAlign w:val="center"/>
-            <w:shd w:val="clear" w:color="auto" w:fill="EEF2F7"/>
+            <w:shd w:val="clear" w:color="auto" w:fill="E6ECF3"/>
             <w:tcBorders>
               <w:top w:val="nil"/>
               <w:left w:val="single" w:sz="24" w:color="1B3358"/>
               <w:bottom w:val="nil"/>
-              <w:right w:val="single" w:sz="48" w:color="FFFFFF"/>
+              <w:right w:val="single" w:sz="48" w:color="F5F7FA"/>
             </w:tcBorders>
             <w:tcMar>
               <w:top w:w="110" w:type="dxa"/>
@@ -6871,12 +6873,12 @@
           <w:tcPr>
             <w:tcW w:type="dxa" w:w="4932"/>
             <w:vAlign w:val="center"/>
-            <w:shd w:val="clear" w:color="auto" w:fill="EEF2F7"/>
+            <w:shd w:val="clear" w:color="auto" w:fill="E6ECF3"/>
             <w:tcBorders>
               <w:top w:val="nil"/>
               <w:left w:val="single" w:sz="24" w:color="2D6A4F"/>
               <w:bottom w:val="nil"/>
-              <w:right w:val="single" w:sz="48" w:color="FFFFFF"/>
+              <w:right w:val="single" w:sz="48" w:color="F5F7FA"/>
             </w:tcBorders>
             <w:tcMar>
               <w:top w:w="110" w:type="dxa"/>
@@ -6920,7 +6922,7 @@
           <w:tcPr>
             <w:tcW w:type="dxa" w:w="4932"/>
             <w:vAlign w:val="center"/>
-            <w:shd w:val="clear" w:color="auto" w:fill="EEF2F7"/>
+            <w:shd w:val="clear" w:color="auto" w:fill="E6ECF3"/>
             <w:tcBorders>
               <w:top w:val="nil"/>
               <w:left w:val="single" w:sz="24" w:color="2D6A4F"/>
@@ -7081,7 +7083,7 @@
                   <w:tcBorders>
                     <w:bottom w:val="single" w:sz="4" w:color="E1E6EC"/>
                   </w:tcBorders>
-                  <w:shd w:val="clear" w:color="auto" w:fill="F4F6FA"/>
+                  <w:shd w:val="clear" w:color="auto" w:fill="ECF0F5"/>
                 </w:tcPr>
                 <w:p>
                   <w:pPr>
@@ -7111,7 +7113,7 @@
                   <w:tcBorders>
                     <w:bottom w:val="single" w:sz="4" w:color="E1E6EC"/>
                   </w:tcBorders>
-                  <w:shd w:val="clear" w:color="auto" w:fill="F4F6FA"/>
+                  <w:shd w:val="clear" w:color="auto" w:fill="ECF0F5"/>
                 </w:tcPr>
                 <w:p>
                   <w:pPr>
@@ -7205,7 +7207,7 @@
                   <w:tcBorders>
                     <w:bottom w:val="single" w:sz="4" w:color="E1E6EC"/>
                   </w:tcBorders>
-                  <w:shd w:val="clear" w:color="auto" w:fill="F4F6FA"/>
+                  <w:shd w:val="clear" w:color="auto" w:fill="ECF0F5"/>
                 </w:tcPr>
                 <w:p>
                   <w:pPr>
@@ -7235,7 +7237,7 @@
                   <w:tcBorders>
                     <w:bottom w:val="single" w:sz="4" w:color="E1E6EC"/>
                   </w:tcBorders>
-                  <w:shd w:val="clear" w:color="auto" w:fill="F4F6FA"/>
+                  <w:shd w:val="clear" w:color="auto" w:fill="ECF0F5"/>
                 </w:tcPr>
                 <w:p>
                   <w:pPr>
@@ -7268,7 +7270,7 @@
                   <w:tcBorders>
                     <w:bottom w:val="single" w:sz="8" w:color="1B3358"/>
                   </w:tcBorders>
-                  <w:shd w:val="clear" w:color="auto" w:fill="EEF2F7"/>
+                  <w:shd w:val="clear" w:color="auto" w:fill="E6ECF3"/>
                 </w:tcPr>
                 <w:p>
                   <w:pPr>
@@ -7298,7 +7300,7 @@
                   <w:tcBorders>
                     <w:bottom w:val="single" w:sz="8" w:color="1B3358"/>
                   </w:tcBorders>
-                  <w:shd w:val="clear" w:color="auto" w:fill="EEF2F7"/>
+                  <w:shd w:val="clear" w:color="auto" w:fill="E6ECF3"/>
                 </w:tcPr>
                 <w:p>
                   <w:pPr>
@@ -7346,7 +7348,7 @@
                           <pic:cNvPicPr/>
                         </pic:nvPicPr>
                         <pic:blipFill>
-                          <a:blip r:embed="rId32"/>
+                          <a:blip r:embed="rId33"/>
                           <a:stretch>
                             <a:fillRect/>
                           </a:stretch>
@@ -7384,7 +7386,7 @@
     <w:p>
       <w:pPr>
         <w:sectPr>
-          <w:footerReference w:type="default" r:id="rId29"/>
+          <w:footerReference w:type="default" r:id="rId30"/>
           <w:pgSz w:w="16838" w:h="11906" w:orient="landscape"/>
           <w:pgMar w:top="1020" w:right="1020" w:bottom="1020" w:left="1020" w:header="720" w:footer="340" w:gutter="0"/>
           <w:cols w:space="720"/>
@@ -7444,7 +7446,7 @@
                           <pic:cNvPicPr/>
                         </pic:nvPicPr>
                         <pic:blipFill>
-                          <a:blip r:embed="rId34"/>
+                          <a:blip r:embed="rId35"/>
                           <a:stretch>
                             <a:fillRect/>
                           </a:stretch>
@@ -7502,7 +7504,7 @@
                           <pic:cNvPicPr/>
                         </pic:nvPicPr>
                         <pic:blipFill>
-                          <a:blip r:embed="rId35"/>
+                          <a:blip r:embed="rId36"/>
                           <a:stretch>
                             <a:fillRect/>
                           </a:stretch>
@@ -7666,12 +7668,12 @@
           <w:tcPr>
             <w:tcW w:type="dxa" w:w="4932"/>
             <w:vAlign w:val="center"/>
-            <w:shd w:val="clear" w:color="auto" w:fill="EEF2F7"/>
+            <w:shd w:val="clear" w:color="auto" w:fill="E6ECF3"/>
             <w:tcBorders>
               <w:top w:val="nil"/>
               <w:left w:val="single" w:sz="24" w:color="2D6A4F"/>
               <w:bottom w:val="nil"/>
-              <w:right w:val="single" w:sz="48" w:color="FFFFFF"/>
+              <w:right w:val="single" w:sz="48" w:color="F5F7FA"/>
             </w:tcBorders>
             <w:tcMar>
               <w:top w:w="110" w:type="dxa"/>
@@ -7715,12 +7717,12 @@
           <w:tcPr>
             <w:tcW w:type="dxa" w:w="4932"/>
             <w:vAlign w:val="center"/>
-            <w:shd w:val="clear" w:color="auto" w:fill="EEF2F7"/>
+            <w:shd w:val="clear" w:color="auto" w:fill="E6ECF3"/>
             <w:tcBorders>
               <w:top w:val="nil"/>
               <w:left w:val="single" w:sz="24" w:color="2D6A4F"/>
               <w:bottom w:val="nil"/>
-              <w:right w:val="single" w:sz="48" w:color="FFFFFF"/>
+              <w:right w:val="single" w:sz="48" w:color="F5F7FA"/>
             </w:tcBorders>
             <w:tcMar>
               <w:top w:w="110" w:type="dxa"/>
@@ -7764,7 +7766,7 @@
           <w:tcPr>
             <w:tcW w:type="dxa" w:w="4932"/>
             <w:vAlign w:val="center"/>
-            <w:shd w:val="clear" w:color="auto" w:fill="EEF2F7"/>
+            <w:shd w:val="clear" w:color="auto" w:fill="E6ECF3"/>
             <w:tcBorders>
               <w:top w:val="nil"/>
               <w:left w:val="single" w:sz="24" w:color="1B3358"/>
@@ -7925,7 +7927,7 @@
                   <w:tcBorders>
                     <w:bottom w:val="single" w:sz="4" w:color="E1E6EC"/>
                   </w:tcBorders>
-                  <w:shd w:val="clear" w:color="auto" w:fill="F4F6FA"/>
+                  <w:shd w:val="clear" w:color="auto" w:fill="ECF0F5"/>
                 </w:tcPr>
                 <w:p>
                   <w:pPr>
@@ -7955,7 +7957,7 @@
                   <w:tcBorders>
                     <w:bottom w:val="single" w:sz="4" w:color="E1E6EC"/>
                   </w:tcBorders>
-                  <w:shd w:val="clear" w:color="auto" w:fill="F4F6FA"/>
+                  <w:shd w:val="clear" w:color="auto" w:fill="ECF0F5"/>
                 </w:tcPr>
                 <w:p>
                   <w:pPr>
@@ -8049,7 +8051,7 @@
                   <w:tcBorders>
                     <w:bottom w:val="single" w:sz="4" w:color="E1E6EC"/>
                   </w:tcBorders>
-                  <w:shd w:val="clear" w:color="auto" w:fill="F4F6FA"/>
+                  <w:shd w:val="clear" w:color="auto" w:fill="ECF0F5"/>
                 </w:tcPr>
                 <w:p>
                   <w:pPr>
@@ -8079,7 +8081,7 @@
                   <w:tcBorders>
                     <w:bottom w:val="single" w:sz="4" w:color="E1E6EC"/>
                   </w:tcBorders>
-                  <w:shd w:val="clear" w:color="auto" w:fill="F4F6FA"/>
+                  <w:shd w:val="clear" w:color="auto" w:fill="ECF0F5"/>
                 </w:tcPr>
                 <w:p>
                   <w:pPr>
@@ -8173,7 +8175,7 @@
                   <w:tcBorders>
                     <w:bottom w:val="single" w:sz="8" w:color="1B3358"/>
                   </w:tcBorders>
-                  <w:shd w:val="clear" w:color="auto" w:fill="EEF2F7"/>
+                  <w:shd w:val="clear" w:color="auto" w:fill="E6ECF3"/>
                 </w:tcPr>
                 <w:p>
                   <w:pPr>
@@ -8203,7 +8205,7 @@
                   <w:tcBorders>
                     <w:bottom w:val="single" w:sz="8" w:color="1B3358"/>
                   </w:tcBorders>
-                  <w:shd w:val="clear" w:color="auto" w:fill="EEF2F7"/>
+                  <w:shd w:val="clear" w:color="auto" w:fill="E6ECF3"/>
                 </w:tcPr>
                 <w:p>
                   <w:pPr>
@@ -8251,7 +8253,7 @@
                           <pic:cNvPicPr/>
                         </pic:nvPicPr>
                         <pic:blipFill>
-                          <a:blip r:embed="rId36"/>
+                          <a:blip r:embed="rId37"/>
                           <a:stretch>
                             <a:fillRect/>
                           </a:stretch>
@@ -8289,7 +8291,7 @@
     <w:p>
       <w:pPr>
         <w:sectPr>
-          <w:footerReference w:type="default" r:id="rId33"/>
+          <w:footerReference w:type="default" r:id="rId34"/>
           <w:pgSz w:w="16838" w:h="11906" w:orient="landscape"/>
           <w:pgMar w:top="1020" w:right="1020" w:bottom="1020" w:left="1020" w:header="720" w:footer="340" w:gutter="0"/>
           <w:cols w:space="720"/>
@@ -8349,7 +8351,7 @@
                           <pic:cNvPicPr/>
                         </pic:nvPicPr>
                         <pic:blipFill>
-                          <a:blip r:embed="rId38"/>
+                          <a:blip r:embed="rId39"/>
                           <a:stretch>
                             <a:fillRect/>
                           </a:stretch>
@@ -8407,7 +8409,7 @@
                           <pic:cNvPicPr/>
                         </pic:nvPicPr>
                         <pic:blipFill>
-                          <a:blip r:embed="rId39"/>
+                          <a:blip r:embed="rId40"/>
                           <a:stretch>
                             <a:fillRect/>
                           </a:stretch>
@@ -8571,12 +8573,12 @@
           <w:tcPr>
             <w:tcW w:type="dxa" w:w="4932"/>
             <w:vAlign w:val="center"/>
-            <w:shd w:val="clear" w:color="auto" w:fill="EEF2F7"/>
+            <w:shd w:val="clear" w:color="auto" w:fill="E6ECF3"/>
             <w:tcBorders>
               <w:top w:val="nil"/>
               <w:left w:val="single" w:sz="24" w:color="1B3358"/>
               <w:bottom w:val="nil"/>
-              <w:right w:val="single" w:sz="48" w:color="FFFFFF"/>
+              <w:right w:val="single" w:sz="48" w:color="F5F7FA"/>
             </w:tcBorders>
             <w:tcMar>
               <w:top w:w="110" w:type="dxa"/>
@@ -8620,12 +8622,12 @@
           <w:tcPr>
             <w:tcW w:type="dxa" w:w="4932"/>
             <w:vAlign w:val="center"/>
-            <w:shd w:val="clear" w:color="auto" w:fill="EEF2F7"/>
+            <w:shd w:val="clear" w:color="auto" w:fill="E6ECF3"/>
             <w:tcBorders>
               <w:top w:val="nil"/>
               <w:left w:val="single" w:sz="24" w:color="1B3358"/>
               <w:bottom w:val="nil"/>
-              <w:right w:val="single" w:sz="48" w:color="FFFFFF"/>
+              <w:right w:val="single" w:sz="48" w:color="F5F7FA"/>
             </w:tcBorders>
             <w:tcMar>
               <w:top w:w="110" w:type="dxa"/>
@@ -8669,7 +8671,7 @@
           <w:tcPr>
             <w:tcW w:type="dxa" w:w="4932"/>
             <w:vAlign w:val="center"/>
-            <w:shd w:val="clear" w:color="auto" w:fill="EEF2F7"/>
+            <w:shd w:val="clear" w:color="auto" w:fill="E6ECF3"/>
             <w:tcBorders>
               <w:top w:val="nil"/>
               <w:left w:val="single" w:sz="24" w:color="1B3358"/>
@@ -8769,7 +8771,7 @@
                   <w:tcBorders>
                     <w:bottom w:val="single" w:sz="8" w:color="1B3358"/>
                   </w:tcBorders>
-                  <w:shd w:val="clear" w:color="auto" w:fill="EEF2F7"/>
+                  <w:shd w:val="clear" w:color="auto" w:fill="E6ECF3"/>
                 </w:tcPr>
                 <w:p>
                   <w:pPr>
@@ -8799,7 +8801,7 @@
                   <w:tcBorders>
                     <w:bottom w:val="single" w:sz="8" w:color="1B3358"/>
                   </w:tcBorders>
-                  <w:shd w:val="clear" w:color="auto" w:fill="EEF2F7"/>
+                  <w:shd w:val="clear" w:color="auto" w:fill="E6ECF3"/>
                 </w:tcPr>
                 <w:p>
                   <w:pPr>
@@ -8832,7 +8834,7 @@
                   <w:tcBorders>
                     <w:bottom w:val="single" w:sz="4" w:color="E1E6EC"/>
                   </w:tcBorders>
-                  <w:shd w:val="clear" w:color="auto" w:fill="F4F6FA"/>
+                  <w:shd w:val="clear" w:color="auto" w:fill="ECF0F5"/>
                 </w:tcPr>
                 <w:p>
                   <w:pPr>
@@ -8862,7 +8864,7 @@
                   <w:tcBorders>
                     <w:bottom w:val="single" w:sz="4" w:color="E1E6EC"/>
                   </w:tcBorders>
-                  <w:shd w:val="clear" w:color="auto" w:fill="F4F6FA"/>
+                  <w:shd w:val="clear" w:color="auto" w:fill="ECF0F5"/>
                 </w:tcPr>
                 <w:p>
                   <w:pPr>
@@ -8956,7 +8958,7 @@
                   <w:tcBorders>
                     <w:bottom w:val="single" w:sz="4" w:color="E1E6EC"/>
                   </w:tcBorders>
-                  <w:shd w:val="clear" w:color="auto" w:fill="F4F6FA"/>
+                  <w:shd w:val="clear" w:color="auto" w:fill="ECF0F5"/>
                 </w:tcPr>
                 <w:p>
                   <w:pPr>
@@ -8986,7 +8988,7 @@
                   <w:tcBorders>
                     <w:bottom w:val="single" w:sz="4" w:color="E1E6EC"/>
                   </w:tcBorders>
-                  <w:shd w:val="clear" w:color="auto" w:fill="F4F6FA"/>
+                  <w:shd w:val="clear" w:color="auto" w:fill="ECF0F5"/>
                 </w:tcPr>
                 <w:p>
                   <w:pPr>
@@ -9080,7 +9082,7 @@
                   <w:tcBorders>
                     <w:bottom w:val="single" w:sz="4" w:color="E1E6EC"/>
                   </w:tcBorders>
-                  <w:shd w:val="clear" w:color="auto" w:fill="F4F6FA"/>
+                  <w:shd w:val="clear" w:color="auto" w:fill="ECF0F5"/>
                 </w:tcPr>
                 <w:p>
                   <w:pPr>
@@ -9110,7 +9112,7 @@
                   <w:tcBorders>
                     <w:bottom w:val="single" w:sz="4" w:color="E1E6EC"/>
                   </w:tcBorders>
-                  <w:shd w:val="clear" w:color="auto" w:fill="F4F6FA"/>
+                  <w:shd w:val="clear" w:color="auto" w:fill="ECF0F5"/>
                 </w:tcPr>
                 <w:p>
                   <w:pPr>
@@ -9204,7 +9206,7 @@
                   <w:tcBorders>
                     <w:bottom w:val="single" w:sz="4" w:color="E1E6EC"/>
                   </w:tcBorders>
-                  <w:shd w:val="clear" w:color="auto" w:fill="F4F6FA"/>
+                  <w:shd w:val="clear" w:color="auto" w:fill="ECF0F5"/>
                 </w:tcPr>
                 <w:p>
                   <w:pPr>
@@ -9234,7 +9236,7 @@
                   <w:tcBorders>
                     <w:bottom w:val="single" w:sz="4" w:color="E1E6EC"/>
                   </w:tcBorders>
-                  <w:shd w:val="clear" w:color="auto" w:fill="F4F6FA"/>
+                  <w:shd w:val="clear" w:color="auto" w:fill="ECF0F5"/>
                 </w:tcPr>
                 <w:p>
                   <w:pPr>
@@ -9282,7 +9284,7 @@
                           <pic:cNvPicPr/>
                         </pic:nvPicPr>
                         <pic:blipFill>
-                          <a:blip r:embed="rId40"/>
+                          <a:blip r:embed="rId41"/>
                           <a:stretch>
                             <a:fillRect/>
                           </a:stretch>
@@ -9307,7 +9309,7 @@
     <w:p>
       <w:pPr>
         <w:sectPr>
-          <w:footerReference w:type="default" r:id="rId37"/>
+          <w:footerReference w:type="default" r:id="rId38"/>
           <w:pgSz w:w="16838" w:h="11906" w:orient="landscape"/>
           <w:pgMar w:top="1020" w:right="1020" w:bottom="1020" w:left="1020" w:header="720" w:footer="340" w:gutter="0"/>
           <w:cols w:space="720"/>
@@ -9367,7 +9369,7 @@
                           <pic:cNvPicPr/>
                         </pic:nvPicPr>
                         <pic:blipFill>
-                          <a:blip r:embed="rId42"/>
+                          <a:blip r:embed="rId43"/>
                           <a:stretch>
                             <a:fillRect/>
                           </a:stretch>
@@ -9425,7 +9427,7 @@
                           <pic:cNvPicPr/>
                         </pic:nvPicPr>
                         <pic:blipFill>
-                          <a:blip r:embed="rId43"/>
+                          <a:blip r:embed="rId44"/>
                           <a:stretch>
                             <a:fillRect/>
                           </a:stretch>
@@ -9512,7 +9514,7 @@
         <w:tc>
           <w:tcPr>
             <w:tcW w:type="dxa" w:w="14797"/>
-            <w:shd w:val="clear" w:color="auto" w:fill="EEF2F7"/>
+            <w:shd w:val="clear" w:color="auto" w:fill="E6ECF3"/>
             <w:tcBorders>
               <w:top w:val="nil"/>
               <w:left w:val="single" w:sz="36" w:color="1B3358"/>
@@ -9589,12 +9591,12 @@
           <w:tcPr>
             <w:tcW w:type="dxa" w:w="4932"/>
             <w:vAlign w:val="center"/>
-            <w:shd w:val="clear" w:color="auto" w:fill="EEF2F7"/>
+            <w:shd w:val="clear" w:color="auto" w:fill="E6ECF3"/>
             <w:tcBorders>
               <w:top w:val="nil"/>
               <w:left w:val="single" w:sz="24" w:color="1B3358"/>
               <w:bottom w:val="nil"/>
-              <w:right w:val="single" w:sz="48" w:color="FFFFFF"/>
+              <w:right w:val="single" w:sz="48" w:color="F5F7FA"/>
             </w:tcBorders>
             <w:tcMar>
               <w:top w:w="110" w:type="dxa"/>
@@ -9638,12 +9640,12 @@
           <w:tcPr>
             <w:tcW w:type="dxa" w:w="4932"/>
             <w:vAlign w:val="center"/>
-            <w:shd w:val="clear" w:color="auto" w:fill="EEF2F7"/>
+            <w:shd w:val="clear" w:color="auto" w:fill="E6ECF3"/>
             <w:tcBorders>
               <w:top w:val="nil"/>
               <w:left w:val="single" w:sz="24" w:color="1B3358"/>
               <w:bottom w:val="nil"/>
-              <w:right w:val="single" w:sz="48" w:color="FFFFFF"/>
+              <w:right w:val="single" w:sz="48" w:color="F5F7FA"/>
             </w:tcBorders>
             <w:tcMar>
               <w:top w:w="110" w:type="dxa"/>
@@ -9687,7 +9689,7 @@
           <w:tcPr>
             <w:tcW w:type="dxa" w:w="4932"/>
             <w:vAlign w:val="center"/>
-            <w:shd w:val="clear" w:color="auto" w:fill="EEF2F7"/>
+            <w:shd w:val="clear" w:color="auto" w:fill="E6ECF3"/>
             <w:tcBorders>
               <w:top w:val="nil"/>
               <w:left w:val="single" w:sz="24" w:color="1B3358"/>
@@ -9869,7 +9871,7 @@
                   <w:tcBorders>
                     <w:bottom w:val="single" w:sz="4" w:color="E1E6EC"/>
                   </w:tcBorders>
-                  <w:shd w:val="clear" w:color="auto" w:fill="F4F6FA"/>
+                  <w:shd w:val="clear" w:color="auto" w:fill="ECF0F5"/>
                 </w:tcPr>
                 <w:p>
                   <w:pPr>
@@ -9899,7 +9901,7 @@
                   <w:tcBorders>
                     <w:bottom w:val="single" w:sz="4" w:color="E1E6EC"/>
                   </w:tcBorders>
-                  <w:shd w:val="clear" w:color="auto" w:fill="F4F6FA"/>
+                  <w:shd w:val="clear" w:color="auto" w:fill="ECF0F5"/>
                 </w:tcPr>
                 <w:p>
                   <w:pPr>
@@ -9993,7 +9995,7 @@
                   <w:tcBorders>
                     <w:bottom w:val="single" w:sz="4" w:color="E1E6EC"/>
                   </w:tcBorders>
-                  <w:shd w:val="clear" w:color="auto" w:fill="F4F6FA"/>
+                  <w:shd w:val="clear" w:color="auto" w:fill="ECF0F5"/>
                 </w:tcPr>
                 <w:p>
                   <w:pPr>
@@ -10023,7 +10025,7 @@
                   <w:tcBorders>
                     <w:bottom w:val="single" w:sz="4" w:color="E1E6EC"/>
                   </w:tcBorders>
-                  <w:shd w:val="clear" w:color="auto" w:fill="F4F6FA"/>
+                  <w:shd w:val="clear" w:color="auto" w:fill="ECF0F5"/>
                 </w:tcPr>
                 <w:p>
                   <w:pPr>
@@ -10056,7 +10058,7 @@
                   <w:tcBorders>
                     <w:bottom w:val="single" w:sz="8" w:color="1B3358"/>
                   </w:tcBorders>
-                  <w:shd w:val="clear" w:color="auto" w:fill="EEF2F7"/>
+                  <w:shd w:val="clear" w:color="auto" w:fill="E6ECF3"/>
                 </w:tcPr>
                 <w:p>
                   <w:pPr>
@@ -10086,7 +10088,7 @@
                   <w:tcBorders>
                     <w:bottom w:val="single" w:sz="8" w:color="1B3358"/>
                   </w:tcBorders>
-                  <w:shd w:val="clear" w:color="auto" w:fill="EEF2F7"/>
+                  <w:shd w:val="clear" w:color="auto" w:fill="E6ECF3"/>
                 </w:tcPr>
                 <w:p>
                   <w:pPr>
@@ -10499,7 +10501,7 @@
                   <w:tcBorders>
                     <w:bottom w:val="single" w:sz="4" w:color="E1E6EC"/>
                   </w:tcBorders>
-                  <w:shd w:val="clear" w:color="auto" w:fill="F4F6FA"/>
+                  <w:shd w:val="clear" w:color="auto" w:fill="ECF0F5"/>
                 </w:tcPr>
                 <w:p>
                   <w:pPr>
@@ -10540,7 +10542,7 @@
                   <w:tcBorders>
                     <w:bottom w:val="single" w:sz="4" w:color="E1E6EC"/>
                   </w:tcBorders>
-                  <w:shd w:val="clear" w:color="auto" w:fill="F4F6FA"/>
+                  <w:shd w:val="clear" w:color="auto" w:fill="ECF0F5"/>
                 </w:tcPr>
                 <w:p>
                   <w:pPr>
@@ -10581,7 +10583,7 @@
                   <w:tcBorders>
                     <w:bottom w:val="single" w:sz="4" w:color="E1E6EC"/>
                   </w:tcBorders>
-                  <w:shd w:val="clear" w:color="auto" w:fill="F4F6FA"/>
+                  <w:shd w:val="clear" w:color="auto" w:fill="ECF0F5"/>
                 </w:tcPr>
                 <w:p>
                   <w:pPr>
@@ -10622,7 +10624,7 @@
                   <w:tcBorders>
                     <w:bottom w:val="single" w:sz="4" w:color="E1E6EC"/>
                   </w:tcBorders>
-                  <w:shd w:val="clear" w:color="auto" w:fill="F4F6FA"/>
+                  <w:shd w:val="clear" w:color="auto" w:fill="ECF0F5"/>
                 </w:tcPr>
                 <w:p>
                   <w:pPr>
@@ -10823,7 +10825,7 @@
                   <w:tcBorders>
                     <w:bottom w:val="single" w:sz="8" w:color="1B3358"/>
                   </w:tcBorders>
-                  <w:shd w:val="clear" w:color="auto" w:fill="EEF2F7"/>
+                  <w:shd w:val="clear" w:color="auto" w:fill="E6ECF3"/>
                 </w:tcPr>
                 <w:p>
                   <w:pPr>
@@ -10864,7 +10866,7 @@
                   <w:tcBorders>
                     <w:bottom w:val="single" w:sz="8" w:color="1B3358"/>
                   </w:tcBorders>
-                  <w:shd w:val="clear" w:color="auto" w:fill="EEF2F7"/>
+                  <w:shd w:val="clear" w:color="auto" w:fill="E6ECF3"/>
                 </w:tcPr>
                 <w:p>
                   <w:pPr>
@@ -10895,7 +10897,7 @@
                   <w:tcBorders>
                     <w:bottom w:val="single" w:sz="8" w:color="1B3358"/>
                   </w:tcBorders>
-                  <w:shd w:val="clear" w:color="auto" w:fill="EEF2F7"/>
+                  <w:shd w:val="clear" w:color="auto" w:fill="E6ECF3"/>
                 </w:tcPr>
                 <w:p>
                   <w:pPr>
@@ -10936,7 +10938,7 @@
                   <w:tcBorders>
                     <w:bottom w:val="single" w:sz="8" w:color="1B3358"/>
                   </w:tcBorders>
-                  <w:shd w:val="clear" w:color="auto" w:fill="EEF2F7"/>
+                  <w:shd w:val="clear" w:color="auto" w:fill="E6ECF3"/>
                 </w:tcPr>
                 <w:p>
                   <w:pPr>
@@ -10982,7 +10984,7 @@
                   <w:tcBorders>
                     <w:bottom w:val="single" w:sz="8" w:color="1B3358"/>
                   </w:tcBorders>
-                  <w:shd w:val="clear" w:color="auto" w:fill="EEF2F7"/>
+                  <w:shd w:val="clear" w:color="auto" w:fill="E6ECF3"/>
                 </w:tcPr>
                 <w:p>
                   <w:pPr>
@@ -11023,7 +11025,7 @@
                   <w:tcBorders>
                     <w:bottom w:val="single" w:sz="8" w:color="1B3358"/>
                   </w:tcBorders>
-                  <w:shd w:val="clear" w:color="auto" w:fill="EEF2F7"/>
+                  <w:shd w:val="clear" w:color="auto" w:fill="E6ECF3"/>
                 </w:tcPr>
                 <w:p>
                   <w:pPr>
@@ -11054,7 +11056,7 @@
                   <w:tcBorders>
                     <w:bottom w:val="single" w:sz="8" w:color="1B3358"/>
                   </w:tcBorders>
-                  <w:shd w:val="clear" w:color="auto" w:fill="EEF2F7"/>
+                  <w:shd w:val="clear" w:color="auto" w:fill="E6ECF3"/>
                 </w:tcPr>
                 <w:p>
                   <w:pPr>
@@ -11095,7 +11097,7 @@
                   <w:tcBorders>
                     <w:bottom w:val="single" w:sz="8" w:color="1B3358"/>
                   </w:tcBorders>
-                  <w:shd w:val="clear" w:color="auto" w:fill="EEF2F7"/>
+                  <w:shd w:val="clear" w:color="auto" w:fill="E6ECF3"/>
                 </w:tcPr>
                 <w:p>
                   <w:pPr>
@@ -11137,7 +11139,7 @@
     <w:p>
       <w:pPr>
         <w:sectPr>
-          <w:footerReference w:type="default" r:id="rId41"/>
+          <w:footerReference w:type="default" r:id="rId42"/>
           <w:pgSz w:w="16838" w:h="11906" w:orient="landscape"/>
           <w:pgMar w:top="1020" w:right="1020" w:bottom="1020" w:left="1020" w:header="720" w:footer="340" w:gutter="0"/>
           <w:cols w:space="720"/>
@@ -11197,7 +11199,7 @@
                           <pic:cNvPicPr/>
                         </pic:nvPicPr>
                         <pic:blipFill>
-                          <a:blip r:embed="rId45"/>
+                          <a:blip r:embed="rId46"/>
                           <a:stretch>
                             <a:fillRect/>
                           </a:stretch>
@@ -11255,7 +11257,7 @@
                           <pic:cNvPicPr/>
                         </pic:nvPicPr>
                         <pic:blipFill>
-                          <a:blip r:embed="rId46"/>
+                          <a:blip r:embed="rId47"/>
                           <a:stretch>
                             <a:fillRect/>
                           </a:stretch>
@@ -11419,12 +11421,12 @@
           <w:tcPr>
             <w:tcW w:type="dxa" w:w="4932"/>
             <w:vAlign w:val="center"/>
-            <w:shd w:val="clear" w:color="auto" w:fill="EEF2F7"/>
+            <w:shd w:val="clear" w:color="auto" w:fill="E6ECF3"/>
             <w:tcBorders>
               <w:top w:val="nil"/>
               <w:left w:val="single" w:sz="24" w:color="2D6A4F"/>
               <w:bottom w:val="nil"/>
-              <w:right w:val="single" w:sz="48" w:color="FFFFFF"/>
+              <w:right w:val="single" w:sz="48" w:color="F5F7FA"/>
             </w:tcBorders>
             <w:tcMar>
               <w:top w:w="110" w:type="dxa"/>
@@ -11468,12 +11470,12 @@
           <w:tcPr>
             <w:tcW w:type="dxa" w:w="4932"/>
             <w:vAlign w:val="center"/>
-            <w:shd w:val="clear" w:color="auto" w:fill="EEF2F7"/>
+            <w:shd w:val="clear" w:color="auto" w:fill="E6ECF3"/>
             <w:tcBorders>
               <w:top w:val="nil"/>
               <w:left w:val="single" w:sz="24" w:color="1B3358"/>
               <w:bottom w:val="nil"/>
-              <w:right w:val="single" w:sz="48" w:color="FFFFFF"/>
+              <w:right w:val="single" w:sz="48" w:color="F5F7FA"/>
             </w:tcBorders>
             <w:tcMar>
               <w:top w:w="110" w:type="dxa"/>
@@ -11517,7 +11519,7 @@
           <w:tcPr>
             <w:tcW w:type="dxa" w:w="4932"/>
             <w:vAlign w:val="center"/>
-            <w:shd w:val="clear" w:color="auto" w:fill="EEF2F7"/>
+            <w:shd w:val="clear" w:color="auto" w:fill="E6ECF3"/>
             <w:tcBorders>
               <w:top w:val="nil"/>
               <w:left w:val="single" w:sz="24" w:color="2D6A4F"/>
@@ -11678,7 +11680,7 @@
                   <w:tcBorders>
                     <w:bottom w:val="single" w:sz="4" w:color="E1E6EC"/>
                   </w:tcBorders>
-                  <w:shd w:val="clear" w:color="auto" w:fill="F4F6FA"/>
+                  <w:shd w:val="clear" w:color="auto" w:fill="ECF0F5"/>
                 </w:tcPr>
                 <w:p>
                   <w:pPr>
@@ -11708,7 +11710,7 @@
                   <w:tcBorders>
                     <w:bottom w:val="single" w:sz="4" w:color="E1E6EC"/>
                   </w:tcBorders>
-                  <w:shd w:val="clear" w:color="auto" w:fill="F4F6FA"/>
+                  <w:shd w:val="clear" w:color="auto" w:fill="ECF0F5"/>
                 </w:tcPr>
                 <w:p>
                   <w:pPr>
@@ -11802,7 +11804,7 @@
                   <w:tcBorders>
                     <w:bottom w:val="single" w:sz="4" w:color="E1E6EC"/>
                   </w:tcBorders>
-                  <w:shd w:val="clear" w:color="auto" w:fill="F4F6FA"/>
+                  <w:shd w:val="clear" w:color="auto" w:fill="ECF0F5"/>
                 </w:tcPr>
                 <w:p>
                   <w:pPr>
@@ -11832,7 +11834,7 @@
                   <w:tcBorders>
                     <w:bottom w:val="single" w:sz="4" w:color="E1E6EC"/>
                   </w:tcBorders>
-                  <w:shd w:val="clear" w:color="auto" w:fill="F4F6FA"/>
+                  <w:shd w:val="clear" w:color="auto" w:fill="ECF0F5"/>
                 </w:tcPr>
                 <w:p>
                   <w:pPr>
@@ -11865,7 +11867,7 @@
                   <w:tcBorders>
                     <w:bottom w:val="single" w:sz="8" w:color="1B3358"/>
                   </w:tcBorders>
-                  <w:shd w:val="clear" w:color="auto" w:fill="EEF2F7"/>
+                  <w:shd w:val="clear" w:color="auto" w:fill="E6ECF3"/>
                 </w:tcPr>
                 <w:p>
                   <w:pPr>
@@ -11895,7 +11897,7 @@
                   <w:tcBorders>
                     <w:bottom w:val="single" w:sz="8" w:color="1B3358"/>
                   </w:tcBorders>
-                  <w:shd w:val="clear" w:color="auto" w:fill="EEF2F7"/>
+                  <w:shd w:val="clear" w:color="auto" w:fill="E6ECF3"/>
                 </w:tcPr>
                 <w:p>
                   <w:pPr>
@@ -11928,7 +11930,7 @@
                   <w:tcBorders>
                     <w:bottom w:val="single" w:sz="4" w:color="E1E6EC"/>
                   </w:tcBorders>
-                  <w:shd w:val="clear" w:color="auto" w:fill="F4F6FA"/>
+                  <w:shd w:val="clear" w:color="auto" w:fill="ECF0F5"/>
                 </w:tcPr>
                 <w:p>
                   <w:pPr>
@@ -11958,7 +11960,7 @@
                   <w:tcBorders>
                     <w:bottom w:val="single" w:sz="4" w:color="E1E6EC"/>
                   </w:tcBorders>
-                  <w:shd w:val="clear" w:color="auto" w:fill="F4F6FA"/>
+                  <w:shd w:val="clear" w:color="auto" w:fill="ECF0F5"/>
                 </w:tcPr>
                 <w:p>
                   <w:pPr>
@@ -12006,7 +12008,7 @@
                           <pic:cNvPicPr/>
                         </pic:nvPicPr>
                         <pic:blipFill>
-                          <a:blip r:embed="rId47"/>
+                          <a:blip r:embed="rId48"/>
                           <a:stretch>
                             <a:fillRect/>
                           </a:stretch>
@@ -12031,7 +12033,7 @@
     <w:p>
       <w:pPr>
         <w:sectPr>
-          <w:footerReference w:type="default" r:id="rId44"/>
+          <w:footerReference w:type="default" r:id="rId45"/>
           <w:pgSz w:w="16838" w:h="11906" w:orient="landscape"/>
           <w:pgMar w:top="1020" w:right="1020" w:bottom="1020" w:left="1020" w:header="720" w:footer="340" w:gutter="0"/>
           <w:cols w:space="720"/>
@@ -12091,7 +12093,7 @@
                           <pic:cNvPicPr/>
                         </pic:nvPicPr>
                         <pic:blipFill>
-                          <a:blip r:embed="rId49"/>
+                          <a:blip r:embed="rId50"/>
                           <a:stretch>
                             <a:fillRect/>
                           </a:stretch>
@@ -12149,7 +12151,7 @@
                           <pic:cNvPicPr/>
                         </pic:nvPicPr>
                         <pic:blipFill>
-                          <a:blip r:embed="rId50"/>
+                          <a:blip r:embed="rId51"/>
                           <a:stretch>
                             <a:fillRect/>
                           </a:stretch>
@@ -12249,7 +12251,7 @@
         <w:tc>
           <w:tcPr>
             <w:tcW w:type="dxa" w:w="14797"/>
-            <w:shd w:val="clear" w:color="auto" w:fill="EEF2F7"/>
+            <w:shd w:val="clear" w:color="auto" w:fill="E6ECF3"/>
             <w:tcBorders>
               <w:top w:val="nil"/>
               <w:left w:val="single" w:sz="36" w:color="1B3358"/>
@@ -12431,7 +12433,7 @@
           <w:tcPr>
             <w:tcW w:type="dxa" w:w="7257"/>
             <w:vAlign w:val="top"/>
-            <w:shd w:val="clear" w:color="auto" w:fill="EEF2F7"/>
+            <w:shd w:val="clear" w:color="auto" w:fill="E6ECF3"/>
             <w:tcBorders>
               <w:top w:val="nil"/>
               <w:left w:val="single" w:sz="30" w:color="2D6A4F"/>
@@ -12465,7 +12467,7 @@
                           <pic:cNvPicPr/>
                         </pic:nvPicPr>
                         <pic:blipFill>
-                          <a:blip r:embed="rId51"/>
+                          <a:blip r:embed="rId52"/>
                           <a:stretch>
                             <a:fillRect/>
                           </a:stretch>
@@ -12602,7 +12604,7 @@
           <w:tcPr>
             <w:tcW w:type="dxa" w:w="7257"/>
             <w:vAlign w:val="top"/>
-            <w:shd w:val="clear" w:color="auto" w:fill="EEF2F7"/>
+            <w:shd w:val="clear" w:color="auto" w:fill="E6ECF3"/>
             <w:tcBorders>
               <w:top w:val="nil"/>
               <w:left w:val="single" w:sz="30" w:color="2D6A4F"/>
@@ -12636,7 +12638,7 @@
                           <pic:cNvPicPr/>
                         </pic:nvPicPr>
                         <pic:blipFill>
-                          <a:blip r:embed="rId52"/>
+                          <a:blip r:embed="rId53"/>
                           <a:stretch>
                             <a:fillRect/>
                           </a:stretch>
@@ -12795,7 +12797,7 @@
           <w:tcPr>
             <w:tcW w:type="dxa" w:w="7257"/>
             <w:vAlign w:val="top"/>
-            <w:shd w:val="clear" w:color="auto" w:fill="EEF2F7"/>
+            <w:shd w:val="clear" w:color="auto" w:fill="E6ECF3"/>
             <w:tcBorders>
               <w:top w:val="nil"/>
               <w:left w:val="single" w:sz="30" w:color="2D6A4F"/>
@@ -12829,7 +12831,7 @@
                           <pic:cNvPicPr/>
                         </pic:nvPicPr>
                         <pic:blipFill>
-                          <a:blip r:embed="rId53"/>
+                          <a:blip r:embed="rId54"/>
                           <a:stretch>
                             <a:fillRect/>
                           </a:stretch>
@@ -12966,7 +12968,7 @@
           <w:tcPr>
             <w:tcW w:type="dxa" w:w="7257"/>
             <w:vAlign w:val="top"/>
-            <w:shd w:val="clear" w:color="auto" w:fill="EEF2F7"/>
+            <w:shd w:val="clear" w:color="auto" w:fill="E6ECF3"/>
             <w:tcBorders>
               <w:top w:val="nil"/>
               <w:left w:val="single" w:sz="30" w:color="2D6A4F"/>
@@ -13000,7 +13002,7 @@
                           <pic:cNvPicPr/>
                         </pic:nvPicPr>
                         <pic:blipFill>
-                          <a:blip r:embed="rId54"/>
+                          <a:blip r:embed="rId55"/>
                           <a:stretch>
                             <a:fillRect/>
                           </a:stretch>
@@ -13137,7 +13139,7 @@
     <w:p>
       <w:pPr>
         <w:sectPr>
-          <w:footerReference w:type="default" r:id="rId48"/>
+          <w:footerReference w:type="default" r:id="rId49"/>
           <w:pgSz w:w="16838" w:h="11906" w:orient="landscape"/>
           <w:pgMar w:top="1020" w:right="1020" w:bottom="1020" w:left="1020" w:header="720" w:footer="340" w:gutter="0"/>
           <w:cols w:space="720"/>
@@ -13197,7 +13199,7 @@
                           <pic:cNvPicPr/>
                         </pic:nvPicPr>
                         <pic:blipFill>
-                          <a:blip r:embed="rId56"/>
+                          <a:blip r:embed="rId57"/>
                           <a:stretch>
                             <a:fillRect/>
                           </a:stretch>
@@ -13255,7 +13257,7 @@
                           <pic:cNvPicPr/>
                         </pic:nvPicPr>
                         <pic:blipFill>
-                          <a:blip r:embed="rId57"/>
+                          <a:blip r:embed="rId58"/>
                           <a:stretch>
                             <a:fillRect/>
                           </a:stretch>
@@ -13334,7 +13336,7 @@
           <w:tcPr>
             <w:tcW w:type="dxa" w:w="14797"/>
             <w:gridSpan w:val="3"/>
-            <w:shd w:val="clear" w:color="auto" w:fill="EEF2F7"/>
+            <w:shd w:val="clear" w:color="auto" w:fill="E6ECF3"/>
             <w:tcMar>
               <w:top w:w="70" w:type="dxa"/>
               <w:bottom w:w="70" w:type="dxa"/>
@@ -13578,7 +13580,7 @@
           <w:tcPr>
             <w:tcW w:type="dxa" w:w="14797"/>
             <w:gridSpan w:val="3"/>
-            <w:shd w:val="clear" w:color="auto" w:fill="EEF2F7"/>
+            <w:shd w:val="clear" w:color="auto" w:fill="E6ECF3"/>
             <w:tcMar>
               <w:top w:w="70" w:type="dxa"/>
               <w:bottom w:w="70" w:type="dxa"/>
@@ -13929,7 +13931,7 @@
           <w:tcPr>
             <w:tcW w:type="dxa" w:w="14797"/>
             <w:gridSpan w:val="3"/>
-            <w:shd w:val="clear" w:color="auto" w:fill="EEF2F7"/>
+            <w:shd w:val="clear" w:color="auto" w:fill="E6ECF3"/>
             <w:tcMar>
               <w:top w:w="70" w:type="dxa"/>
               <w:bottom w:w="70" w:type="dxa"/>
@@ -14066,7 +14068,7 @@
           <w:tcPr>
             <w:tcW w:type="dxa" w:w="14797"/>
             <w:gridSpan w:val="3"/>
-            <w:shd w:val="clear" w:color="auto" w:fill="EEF2F7"/>
+            <w:shd w:val="clear" w:color="auto" w:fill="E6ECF3"/>
             <w:tcMar>
               <w:top w:w="70" w:type="dxa"/>
               <w:bottom w:w="70" w:type="dxa"/>
@@ -14429,7 +14431,7 @@
     <w:p>
       <w:pPr>
         <w:sectPr>
-          <w:footerReference w:type="default" r:id="rId55"/>
+          <w:footerReference w:type="default" r:id="rId56"/>
           <w:pgSz w:w="16838" w:h="11906" w:orient="landscape"/>
           <w:pgMar w:top="1020" w:right="1020" w:bottom="1020" w:left="1020" w:header="720" w:footer="340" w:gutter="0"/>
           <w:cols w:space="720"/>
@@ -14489,7 +14491,7 @@
                           <pic:cNvPicPr/>
                         </pic:nvPicPr>
                         <pic:blipFill>
-                          <a:blip r:embed="rId59"/>
+                          <a:blip r:embed="rId60"/>
                           <a:stretch>
                             <a:fillRect/>
                           </a:stretch>
@@ -14547,7 +14549,7 @@
                           <pic:cNvPicPr/>
                         </pic:nvPicPr>
                         <pic:blipFill>
-                          <a:blip r:embed="rId60"/>
+                          <a:blip r:embed="rId61"/>
                           <a:stretch>
                             <a:fillRect/>
                           </a:stretch>
@@ -14634,7 +14636,7 @@
       </w:r>
     </w:p>
     <w:sectPr>
-      <w:footerReference w:type="default" r:id="rId58"/>
+      <w:footerReference w:type="default" r:id="rId59"/>
       <w:pgSz w:w="16838" w:h="11906" w:orient="landscape"/>
       <w:pgMar w:top="1020" w:right="1020" w:bottom="1020" w:left="1020" w:header="720" w:footer="340" w:gutter="0"/>
       <w:cols w:space="720"/>
@@ -15979,6 +15981,59 @@
   <w:p>
     <w:pPr>
       <w:pStyle w:val="Header"/>
+    </w:pPr>
+    <w:r>
+      <w:drawing>
+        <wp:anchor distT="0" distB="0" distL="0" distR="0" simplePos="0" relativeHeight="0" behindDoc="1" locked="1" layoutInCell="1" allowOverlap="1">
+          <wp:simplePos x="0" y="0"/>
+          <wp:positionH relativeFrom="page">
+            <wp:posOffset>0</wp:posOffset>
+          </wp:positionH>
+          <wp:positionV relativeFrom="page">
+            <wp:posOffset>0</wp:posOffset>
+          </wp:positionV>
+          <wp:extent cx="10692000" cy="7560000"/>
+          <wp:effectExtent l="0" t="0" r="0" b="0"/>
+          <wp:wrapNone/>
+          <wp:docPr id="1" name="Picture 1"/>
+          <wp:cNvGraphicFramePr xmlns:a="http://schemas.openxmlformats.org/drawingml/2006/main">
+            <a:graphicFrameLocks noChangeAspect="1"/>
+          </wp:cNvGraphicFramePr>
+          <a:graphic xmlns:a="http://schemas.openxmlformats.org/drawingml/2006/main" xmlns:pic="http://schemas.openxmlformats.org/drawingml/2006/picture">
+            <a:graphicData uri="http://schemas.openxmlformats.org/drawingml/2006/picture">
+              <pic:pic>
+                <pic:nvPicPr>
+                  <pic:cNvPr id="0" name="image.png"/>
+                  <pic:cNvPicPr/>
+                </pic:nvPicPr>
+                <pic:blipFill>
+                  <a:blip r:embed="rId1"/>
+                  <a:stretch>
+                    <a:fillRect/>
+                  </a:stretch>
+                </pic:blipFill>
+                <pic:spPr>
+                  <a:xfrm>
+                    <a:off x="0" y="0"/>
+                    <a:ext cx="10692000" cy="7560000"/>
+                  </a:xfrm>
+                  <a:prstGeom prst="rect"/>
+                </pic:spPr>
+              </pic:pic>
+            </a:graphicData>
+          </a:graphic>
+        </wp:anchor>
+      </w:drawing>
+    </w:r>
+  </w:p>
+</w:hdr>
+</file>
+
+<file path=word/header2.xml><?xml version="1.0" encoding="utf-8"?>
+<w:hdr xmlns:m="http://schemas.openxmlformats.org/officeDocument/2006/math" xmlns:mc="http://schemas.openxmlformats.org/markup-compatibility/2006" xmlns:mo="http://schemas.microsoft.com/office/mac/office/2008/main" xmlns:mv="urn:schemas-microsoft-com:mac:vml" xmlns:o="urn:schemas-microsoft-com:office:office" xmlns:r="http://schemas.openxmlformats.org/officeDocument/2006/relationships" xmlns:v="urn:schemas-microsoft-com:vml" xmlns:w10="urn:schemas-microsoft-com:office:word" xmlns:w14="http://schemas.microsoft.com/office/word/2010/wordml" xmlns:w="http://schemas.openxmlformats.org/wordprocessingml/2006/main" xmlns:wne="http://schemas.microsoft.com/office/word/2006/wordml" xmlns:wp14="http://schemas.microsoft.com/office/word/2010/wordprocessingDrawing" xmlns:wp="http://schemas.openxmlformats.org/drawingml/2006/wordprocessingDrawing" xmlns:wpc="http://schemas.microsoft.com/office/word/2010/wordprocessingCanvas" xmlns:wpg="http://schemas.microsoft.com/office/word/2010/wordprocessingGroup" xmlns:wpi="http://schemas.microsoft.com/office/word/2010/wordprocessingInk" xmlns:wps="http://schemas.microsoft.com/office/word/2010/wordprocessingShape" mc:Ignorable="w14 wp14">
+  <w:p>
+    <w:pPr>
+      <w:pStyle w:val="Header"/>
       <w:tabs>
         <w:tab w:pos="4680" w:val="clear"/>
         <w:tab w:pos="9360" w:val="clear"/>
@@ -16009,6 +16064,49 @@
       </w:rPr>
       <w:tab/>
       <w:t>12 Rue Michelet 42000 Saint-Étienne — Location longue durée</w:t>
+    </w:r>
+    <w:r>
+      <w:drawing>
+        <wp:anchor distT="0" distB="0" distL="0" distR="0" simplePos="0" relativeHeight="0" behindDoc="1" locked="1" layoutInCell="1" allowOverlap="1">
+          <wp:simplePos x="0" y="0"/>
+          <wp:positionH relativeFrom="page">
+            <wp:posOffset>0</wp:posOffset>
+          </wp:positionH>
+          <wp:positionV relativeFrom="page">
+            <wp:posOffset>0</wp:posOffset>
+          </wp:positionV>
+          <wp:extent cx="10692000" cy="7560000"/>
+          <wp:effectExtent l="0" t="0" r="0" b="0"/>
+          <wp:wrapNone/>
+          <wp:docPr id="1" name="Picture 1"/>
+          <wp:cNvGraphicFramePr xmlns:a="http://schemas.openxmlformats.org/drawingml/2006/main">
+            <a:graphicFrameLocks noChangeAspect="1"/>
+          </wp:cNvGraphicFramePr>
+          <a:graphic xmlns:a="http://schemas.openxmlformats.org/drawingml/2006/main" xmlns:pic="http://schemas.openxmlformats.org/drawingml/2006/picture">
+            <a:graphicData uri="http://schemas.openxmlformats.org/drawingml/2006/picture">
+              <pic:pic>
+                <pic:nvPicPr>
+                  <pic:cNvPr id="0" name="image.png"/>
+                  <pic:cNvPicPr/>
+                </pic:nvPicPr>
+                <pic:blipFill>
+                  <a:blip r:embed="rId1"/>
+                  <a:stretch>
+                    <a:fillRect/>
+                  </a:stretch>
+                </pic:blipFill>
+                <pic:spPr>
+                  <a:xfrm>
+                    <a:off x="0" y="0"/>
+                    <a:ext cx="10692000" cy="7560000"/>
+                  </a:xfrm>
+                  <a:prstGeom prst="rect"/>
+                </pic:spPr>
+              </pic:pic>
+            </a:graphicData>
+          </a:graphic>
+        </wp:anchor>
+      </w:drawing>
     </w:r>
   </w:p>
 </w:hdr>

</xml_diff>

<commit_message>
Cash-flow en année courante (après différé, hors déductions ponctuelles), meilleur régime sur toute la durée, montant à financer
Co-Authored-By: Claude Opus 5.5 <noreply@anthropic.com>
</commit_message>
<xml_diff>
--- a/app/data/exemple-dossier/Exemple de dossier de financement.docx
+++ b/app/data/exemple-dossier/Exemple de dossier de financement.docx
@@ -302,7 +302,7 @@
                 <w:color w:val="2D6A4F"/>
                 <w:sz w:val="44"/>
               </w:rPr>
-              <w:t>46 €</w:t>
+              <w:t>23 €</w:t>
             </w:r>
           </w:p>
         </w:tc>
@@ -380,7 +380,7 @@
           <w:color w:val="5B6672"/>
           <w:sz w:val="22"/>
         </w:rPr>
-        <w:t>Emprunteur : Camille Exemple (emprunteur fictif)   ·   Document établi le 08/10/2026</w:t>
+        <w:t>Emprunteur : Camille Exemple (emprunteur fictif)   ·   Document établi le 10/10/2026</w:t>
       </w:r>
     </w:p>
     <w:p>
@@ -6788,7 +6788,7 @@
                 <w:color w:val="2D6A4F"/>
                 <w:sz w:val="23"/>
               </w:rPr>
-              <w:t>Le loyer couvre toutes les dépenses du bien et dégage 46 € par mois.</w:t>
+              <w:t>Le loyer couvre toutes les dépenses du bien et dégage 23 € par mois.</w:t>
             </w:r>
           </w:p>
         </w:tc>
@@ -6865,7 +6865,7 @@
                 <w:color w:val="1B3358"/>
                 <w:sz w:val="34"/>
               </w:rPr>
-              <w:t>674 €</w:t>
+              <w:t>681 €</w:t>
             </w:r>
           </w:p>
         </w:tc>
@@ -6914,7 +6914,7 @@
                 <w:color w:val="2D6A4F"/>
                 <w:sz w:val="34"/>
               </w:rPr>
-              <w:t>46 €</w:t>
+              <w:t>23 €</w:t>
             </w:r>
           </w:p>
         </w:tc>
@@ -7065,7 +7065,7 @@
                       <w:color w:val="1F2833"/>
                       <w:sz w:val="22"/>
                     </w:rPr>
-                    <w:t>+674 €</w:t>
+                    <w:t>+681 €</w:t>
                   </w:r>
                 </w:p>
               </w:tc>
@@ -7128,7 +7128,7 @@
                       <w:color w:val="B23A32"/>
                       <w:sz w:val="22"/>
                     </w:rPr>
-                    <w:t>-208 €</w:t>
+                    <w:t>-238 €</w:t>
                   </w:r>
                 </w:p>
               </w:tc>
@@ -7315,7 +7315,7 @@
                       <w:color w:val="1B3358"/>
                       <w:sz w:val="23"/>
                     </w:rPr>
-                    <w:t>46 €</w:t>
+                    <w:t>23 €</w:t>
                   </w:r>
                 </w:p>
               </w:tc>
@@ -7380,7 +7380,7 @@
           <w:color w:val="969EA8"/>
           <w:sz w:val="18"/>
         </w:rPr>
-        <w:t>Moyenne mensuelle de la première année, régime LMNP au réel. Les charges comprennent copropriété, taxe foncière, assurances, entretien et frais de gestion.</w:t>
+        <w:t>Moyenne mensuelle de l'année 2, première année courante (hors différé de crédit et hors déductions ponctuelles de l'année 1), régime LMNP au réel. Les charges comprennent copropriété, taxe foncière, assurances, entretien et frais de gestion.</w:t>
       </w:r>
     </w:p>
     <w:p>
@@ -12312,7 +12312,7 @@
                 <w:color w:val="1F2833"/>
                 <w:sz w:val="21"/>
               </w:rPr>
-              <w:t xml:space="preserve"> : cash-flow net de +46 € par mois après crédit, charges et impôts</w:t>
+              <w:t xml:space="preserve"> : cash-flow net de +23 € par mois après crédit, charges et impôts</w:t>
             </w:r>
           </w:p>
           <w:p>
@@ -12703,7 +12703,7 @@
                 <w:sz w:val="23"/>
               </w:rPr>
               <w:tab/>
-              <w:t>46 €</w:t>
+              <w:t>23 €</w:t>
             </w:r>
           </w:p>
           <w:p>

</xml_diff>